<commit_message>
Addition of Expesed WIP column in Production Order – WIP report
</commit_message>
<xml_diff>
--- a/src/Layers/W1/BaseApp/Manufacturing/Reports/InventoryValuationWIP.docx
+++ b/src/Layers/W1/BaseApp/Manufacturing/Reports/InventoryValuationWIP.docx
@@ -7,12 +7,12 @@
         <w:tblStyle w:val="TableGrid"/>
         <w:tblW w:w="15398" w:type="dxa"/>
         <w:tblBorders>
-          <w:top w:val="none" w:sz="0" w:space="0" w:color="auto"/>
-          <w:left w:val="none" w:sz="0" w:space="0" w:color="auto"/>
-          <w:bottom w:val="none" w:sz="0" w:space="0" w:color="auto"/>
-          <w:right w:val="none" w:sz="0" w:space="0" w:color="auto"/>
-          <w:insideH w:val="none" w:sz="0" w:space="0" w:color="auto"/>
-          <w:insideV w:val="none" w:sz="0" w:space="0" w:color="auto"/>
+          <w:top w:val="none" w:color="auto" w:sz="0" w:space="0"/>
+          <w:left w:val="none" w:color="auto" w:sz="0" w:space="0"/>
+          <w:bottom w:val="none" w:color="auto" w:sz="0" w:space="0"/>
+          <w:right w:val="none" w:color="auto" w:sz="0" w:space="0"/>
+          <w:insideH w:val="none" w:color="auto" w:sz="0" w:space="0"/>
+          <w:insideV w:val="none" w:color="auto" w:sz="0" w:space="0"/>
         </w:tblBorders>
         <w:tblLayout w:type="fixed"/>
         <w:tblLook w:val="04A0" w:firstRow="1" w:lastRow="0" w:firstColumn="1" w:lastColumn="0" w:noHBand="0" w:noVBand="1"/>
@@ -20,7 +20,7 @@
       <w:tblGrid>
         <w:gridCol w:w="993"/>
         <w:gridCol w:w="850"/>
-        <w:gridCol w:w="2268"/>
+        <w:gridCol w:w="1500"/>
         <w:gridCol w:w="1134"/>
         <w:gridCol w:w="1134"/>
         <w:gridCol w:w="1701"/>
@@ -28,11 +28,12 @@
         <w:gridCol w:w="1276"/>
         <w:gridCol w:w="1275"/>
         <w:gridCol w:w="1701"/>
-        <w:gridCol w:w="1790"/>
+        <w:gridCol w:w="1282"/>
+        <w:gridCol w:w="1276"/>
       </w:tblGrid>
       <w:tr>
         <w:trPr>
-          <w:trHeight w:hRule="exact" w:val="340"/>
+          <w:trHeight w:val="340" w:hRule="exact"/>
         </w:trPr>
         <w:sdt>
           <w:sdtPr>
@@ -44,12 +45,12 @@
               <w:szCs w:val="16"/>
             </w:rPr>
             <w:alias w:val="#Nav: /Labels/Status_ProductionOrderCaption"/>
-            <w:tag w:val="#Nav: FS_YSD_InventoryValuationWIP/50008"/>
+            <w:tag w:val="#Nav: Inventory_Valuation_WIP/5802"/>
             <w:id w:val="441974797"/>
             <w:placeholder>
               <w:docPart w:val="DefaultPlaceholder_-1854013440"/>
             </w:placeholder>
-            <w:dataBinding w:prefixMappings="xmlns:ns0='urn:microsoft-dynamics-nav/reports/FS_YSD_InventoryValuationWIP/50008/' " w:xpath="/ns0:NavWordReportXmlPart[1]/ns0:Labels[1]/ns0:Status_ProductionOrderCaption[1]" w:storeItemID="{3F37AC5C-CB25-4576-B933-8E34232D5829}"/>
+            <w:dataBinding w:prefixMappings="xmlns:ns0='urn:microsoft-dynamics-nav/reports/Inventory_Valuation_WIP/5802/'" w:xpath="/ns0:NavWordReportXmlPart[1]/ns0:Labels[1]/ns0:Status_ProductionOrderCaption[1]" w:storeItemID="{3F37AC5C-CB25-4576-B933-8E34232D5829}"/>
             <w:text/>
           </w:sdtPr>
           <w:sdtContent>
@@ -57,7 +58,7 @@
               <w:tcPr>
                 <w:tcW w:w="993" w:type="dxa"/>
                 <w:tcBorders>
-                  <w:bottom w:val="single" w:sz="4" w:space="0" w:color="auto"/>
+                  <w:bottom w:val="single" w:color="auto" w:sz="4" w:space="0"/>
                 </w:tcBorders>
                 <w:vAlign w:val="bottom"/>
               </w:tcPr>
@@ -97,12 +98,12 @@
               <w:szCs w:val="16"/>
             </w:rPr>
             <w:alias w:val="#Nav: /Labels/No_ProductionOrderCaption"/>
-            <w:tag w:val="#Nav: FS_YSD_InventoryValuationWIP/50008"/>
+            <w:tag w:val="#Nav: Inventory_Valuation_WIP/5802"/>
             <w:id w:val="-420407461"/>
             <w:placeholder>
               <w:docPart w:val="DefaultPlaceholder_-1854013440"/>
             </w:placeholder>
-            <w:dataBinding w:prefixMappings="xmlns:ns0='urn:microsoft-dynamics-nav/reports/FS_YSD_InventoryValuationWIP/50008/' " w:xpath="/ns0:NavWordReportXmlPart[1]/ns0:Labels[1]/ns0:No_ProductionOrderCaption[1]" w:storeItemID="{3F37AC5C-CB25-4576-B933-8E34232D5829}"/>
+            <w:dataBinding w:prefixMappings="xmlns:ns0='urn:microsoft-dynamics-nav/reports/Inventory_Valuation_WIP/5802/'" w:xpath="/ns0:NavWordReportXmlPart[1]/ns0:Labels[1]/ns0:No_ProductionOrderCaption[1]" w:storeItemID="{3F37AC5C-CB25-4576-B933-8E34232D5829}"/>
             <w:text/>
           </w:sdtPr>
           <w:sdtContent>
@@ -110,7 +111,7 @@
               <w:tcPr>
                 <w:tcW w:w="850" w:type="dxa"/>
                 <w:tcBorders>
-                  <w:bottom w:val="single" w:sz="4" w:space="0" w:color="auto"/>
+                  <w:bottom w:val="single" w:color="auto" w:sz="4" w:space="0"/>
                 </w:tcBorders>
                 <w:vAlign w:val="bottom"/>
               </w:tcPr>
@@ -150,20 +151,20 @@
               <w:szCs w:val="16"/>
             </w:rPr>
             <w:alias w:val="#Nav: /Labels/Desc_ProductionOrderCaption"/>
-            <w:tag w:val="#Nav: FS_YSD_InventoryValuationWIP/50008"/>
+            <w:tag w:val="#Nav: Inventory_Valuation_WIP/5802"/>
             <w:id w:val="-244583068"/>
             <w:placeholder>
               <w:docPart w:val="DefaultPlaceholder_-1854013440"/>
             </w:placeholder>
-            <w:dataBinding w:prefixMappings="xmlns:ns0='urn:microsoft-dynamics-nav/reports/FS_YSD_InventoryValuationWIP/50008/' " w:xpath="/ns0:NavWordReportXmlPart[1]/ns0:Labels[1]/ns0:Desc_ProductionOrderCaption[1]" w:storeItemID="{3F37AC5C-CB25-4576-B933-8E34232D5829}"/>
+            <w:dataBinding w:prefixMappings="xmlns:ns0='urn:microsoft-dynamics-nav/reports/Inventory_Valuation_WIP/5802/'" w:xpath="/ns0:NavWordReportXmlPart[1]/ns0:Labels[1]/ns0:Desc_ProductionOrderCaption[1]" w:storeItemID="{3F37AC5C-CB25-4576-B933-8E34232D5829}"/>
             <w:text/>
           </w:sdtPr>
           <w:sdtContent>
             <w:tc>
               <w:tcPr>
-                <w:tcW w:w="2268" w:type="dxa"/>
+                <w:tcW w:w="1500" w:type="dxa"/>
                 <w:tcBorders>
-                  <w:bottom w:val="single" w:sz="4" w:space="0" w:color="auto"/>
+                  <w:bottom w:val="single" w:color="auto" w:sz="4" w:space="0"/>
                 </w:tcBorders>
                 <w:vAlign w:val="bottom"/>
               </w:tcPr>
@@ -203,12 +204,12 @@
               <w:szCs w:val="16"/>
             </w:rPr>
             <w:alias w:val="#Nav: /Labels/SrcType_ProductionOrderCaption"/>
-            <w:tag w:val="#Nav: FS_YSD_InventoryValuationWIP/50008"/>
+            <w:tag w:val="#Nav: Inventory_Valuation_WIP/5802"/>
             <w:id w:val="1788778592"/>
             <w:placeholder>
               <w:docPart w:val="DefaultPlaceholder_-1854013440"/>
             </w:placeholder>
-            <w:dataBinding w:prefixMappings="xmlns:ns0='urn:microsoft-dynamics-nav/reports/FS_YSD_InventoryValuationWIP/50008/' " w:xpath="/ns0:NavWordReportXmlPart[1]/ns0:Labels[1]/ns0:SrcType_ProductionOrderCaption[1]" w:storeItemID="{3F37AC5C-CB25-4576-B933-8E34232D5829}"/>
+            <w:dataBinding w:prefixMappings="xmlns:ns0='urn:microsoft-dynamics-nav/reports/Inventory_Valuation_WIP/5802/'" w:xpath="/ns0:NavWordReportXmlPart[1]/ns0:Labels[1]/ns0:SrcType_ProductionOrderCaption[1]" w:storeItemID="{3F37AC5C-CB25-4576-B933-8E34232D5829}"/>
             <w:text/>
           </w:sdtPr>
           <w:sdtContent>
@@ -216,7 +217,7 @@
               <w:tcPr>
                 <w:tcW w:w="1134" w:type="dxa"/>
                 <w:tcBorders>
-                  <w:bottom w:val="single" w:sz="4" w:space="0" w:color="auto"/>
+                  <w:bottom w:val="single" w:color="auto" w:sz="4" w:space="0"/>
                 </w:tcBorders>
                 <w:vAlign w:val="bottom"/>
               </w:tcPr>
@@ -256,12 +257,12 @@
               <w:szCs w:val="16"/>
             </w:rPr>
             <w:alias w:val="#Nav: /Labels/SourceNo_ProductionOrderCaption"/>
-            <w:tag w:val="#Nav: FS_YSD_InventoryValuationWIP/50008"/>
+            <w:tag w:val="#Nav: Inventory_Valuation_WIP/5802"/>
             <w:id w:val="548958105"/>
             <w:placeholder>
               <w:docPart w:val="DefaultPlaceholder_-1854013440"/>
             </w:placeholder>
-            <w:dataBinding w:prefixMappings="xmlns:ns0='urn:microsoft-dynamics-nav/reports/FS_YSD_InventoryValuationWIP/50008/' " w:xpath="/ns0:NavWordReportXmlPart[1]/ns0:Labels[1]/ns0:SourceNo_ProductionOrderCaption[1]" w:storeItemID="{3F37AC5C-CB25-4576-B933-8E34232D5829}"/>
+            <w:dataBinding w:prefixMappings="xmlns:ns0='urn:microsoft-dynamics-nav/reports/Inventory_Valuation_WIP/5802/'" w:xpath="/ns0:NavWordReportXmlPart[1]/ns0:Labels[1]/ns0:SourceNo_ProductionOrderCaption[1]" w:storeItemID="{3F37AC5C-CB25-4576-B933-8E34232D5829}"/>
             <w:text/>
           </w:sdtPr>
           <w:sdtContent>
@@ -269,7 +270,7 @@
               <w:tcPr>
                 <w:tcW w:w="1134" w:type="dxa"/>
                 <w:tcBorders>
-                  <w:bottom w:val="single" w:sz="4" w:space="0" w:color="auto"/>
+                  <w:bottom w:val="single" w:color="auto" w:sz="4" w:space="0"/>
                 </w:tcBorders>
                 <w:vAlign w:val="bottom"/>
               </w:tcPr>
@@ -309,12 +310,12 @@
               <w:szCs w:val="16"/>
             </w:rPr>
             <w:alias w:val="#Nav: /Production_Order/AsOfStartDateText"/>
-            <w:tag w:val="#Nav: FS_YSD_InventoryValuationWIP/50008"/>
+            <w:tag w:val="#Nav: Inventory_Valuation_WIP/5802"/>
             <w:id w:val="1895539344"/>
             <w:placeholder>
               <w:docPart w:val="DefaultPlaceholder_-1854013440"/>
             </w:placeholder>
-            <w:dataBinding w:prefixMappings="xmlns:ns0='urn:microsoft-dynamics-nav/reports/FS_YSD_InventoryValuationWIP/50008/' " w:xpath="/ns0:NavWordReportXmlPart[1]/ns0:Production_Order[1]/ns0:AsOfStartDateText[1]" w:storeItemID="{3F37AC5C-CB25-4576-B933-8E34232D5829}"/>
+            <w:dataBinding w:prefixMappings="xmlns:ns0='urn:microsoft-dynamics-nav/reports/Inventory_Valuation_WIP/5802/'" w:xpath="/ns0:NavWordReportXmlPart[1]/ns0:Production_Order[1]/ns0:AsOfStartDateText[1]" w:storeItemID="{3F37AC5C-CB25-4576-B933-8E34232D5829}"/>
             <w:text/>
           </w:sdtPr>
           <w:sdtContent>
@@ -322,7 +323,7 @@
               <w:tcPr>
                 <w:tcW w:w="1701" w:type="dxa"/>
                 <w:tcBorders>
-                  <w:bottom w:val="single" w:sz="4" w:space="0" w:color="auto"/>
+                  <w:bottom w:val="single" w:color="auto" w:sz="4" w:space="0"/>
                 </w:tcBorders>
                 <w:vAlign w:val="bottom"/>
               </w:tcPr>
@@ -363,12 +364,12 @@
               <w:szCs w:val="16"/>
             </w:rPr>
             <w:alias w:val="#Nav: /Labels/ConsumptionLbl"/>
-            <w:tag w:val="#Nav: FS_YSD_InventoryValuationWIP/50008"/>
+            <w:tag w:val="#Nav: Inventory_Valuation_WIP/5802"/>
             <w:id w:val="-1031794932"/>
             <w:placeholder>
               <w:docPart w:val="DefaultPlaceholder_-1854013440"/>
             </w:placeholder>
-            <w:dataBinding w:prefixMappings="xmlns:ns0='urn:microsoft-dynamics-nav/reports/FS_YSD_InventoryValuationWIP/50008/' " w:xpath="/ns0:NavWordReportXmlPart[1]/ns0:Labels[1]/ns0:ConsumptionLbl[1]" w:storeItemID="{3F37AC5C-CB25-4576-B933-8E34232D5829}"/>
+            <w:dataBinding w:prefixMappings="xmlns:ns0='urn:microsoft-dynamics-nav/reports/Inventory_Valuation_WIP/5802/'" w:xpath="/ns0:NavWordReportXmlPart[1]/ns0:Labels[1]/ns0:ConsumptionLbl[1]" w:storeItemID="{3F37AC5C-CB25-4576-B933-8E34232D5829}"/>
             <w:text/>
           </w:sdtPr>
           <w:sdtContent>
@@ -376,7 +377,7 @@
               <w:tcPr>
                 <w:tcW w:w="1276" w:type="dxa"/>
                 <w:tcBorders>
-                  <w:bottom w:val="single" w:sz="4" w:space="0" w:color="auto"/>
+                  <w:bottom w:val="single" w:color="auto" w:sz="4" w:space="0"/>
                 </w:tcBorders>
                 <w:vAlign w:val="bottom"/>
               </w:tcPr>
@@ -417,12 +418,12 @@
               <w:szCs w:val="16"/>
             </w:rPr>
             <w:alias w:val="#Nav: /Labels/CapacityLbl"/>
-            <w:tag w:val="#Nav: FS_YSD_InventoryValuationWIP/50008"/>
+            <w:tag w:val="#Nav: Inventory_Valuation_WIP/5802"/>
             <w:id w:val="-28956946"/>
             <w:placeholder>
               <w:docPart w:val="DefaultPlaceholder_-1854013440"/>
             </w:placeholder>
-            <w:dataBinding w:prefixMappings="xmlns:ns0='urn:microsoft-dynamics-nav/reports/FS_YSD_InventoryValuationWIP/50008/' " w:xpath="/ns0:NavWordReportXmlPart[1]/ns0:Labels[1]/ns0:CapacityLbl[1]" w:storeItemID="{3F37AC5C-CB25-4576-B933-8E34232D5829}"/>
+            <w:dataBinding w:prefixMappings="xmlns:ns0='urn:microsoft-dynamics-nav/reports/Inventory_Valuation_WIP/5802/'" w:xpath="/ns0:NavWordReportXmlPart[1]/ns0:Labels[1]/ns0:CapacityLbl[1]" w:storeItemID="{3F37AC5C-CB25-4576-B933-8E34232D5829}"/>
             <w:text/>
           </w:sdtPr>
           <w:sdtContent>
@@ -430,7 +431,7 @@
               <w:tcPr>
                 <w:tcW w:w="1276" w:type="dxa"/>
                 <w:tcBorders>
-                  <w:bottom w:val="single" w:sz="4" w:space="0" w:color="auto"/>
+                  <w:bottom w:val="single" w:color="auto" w:sz="4" w:space="0"/>
                 </w:tcBorders>
                 <w:vAlign w:val="bottom"/>
               </w:tcPr>
@@ -471,12 +472,12 @@
               <w:szCs w:val="16"/>
             </w:rPr>
             <w:alias w:val="#Nav: /Labels/OutputLbl"/>
-            <w:tag w:val="#Nav: FS_YSD_InventoryValuationWIP/50008"/>
+            <w:tag w:val="#Nav: Inventory_Valuation_WIP/5802"/>
             <w:id w:val="-1200556878"/>
             <w:placeholder>
               <w:docPart w:val="DefaultPlaceholder_-1854013440"/>
             </w:placeholder>
-            <w:dataBinding w:prefixMappings="xmlns:ns0='urn:microsoft-dynamics-nav/reports/FS_YSD_InventoryValuationWIP/50008/' " w:xpath="/ns0:NavWordReportXmlPart[1]/ns0:Labels[1]/ns0:OutputLbl[1]" w:storeItemID="{3F37AC5C-CB25-4576-B933-8E34232D5829}"/>
+            <w:dataBinding w:prefixMappings="xmlns:ns0='urn:microsoft-dynamics-nav/reports/Inventory_Valuation_WIP/5802/'" w:xpath="/ns0:NavWordReportXmlPart[1]/ns0:Labels[1]/ns0:OutputLbl[1]" w:storeItemID="{3F37AC5C-CB25-4576-B933-8E34232D5829}"/>
             <w:text/>
           </w:sdtPr>
           <w:sdtContent>
@@ -484,7 +485,7 @@
               <w:tcPr>
                 <w:tcW w:w="1275" w:type="dxa"/>
                 <w:tcBorders>
-                  <w:bottom w:val="single" w:sz="4" w:space="0" w:color="auto"/>
+                  <w:bottom w:val="single" w:color="auto" w:sz="4" w:space="0"/>
                 </w:tcBorders>
                 <w:vAlign w:val="bottom"/>
               </w:tcPr>
@@ -525,12 +526,12 @@
               <w:szCs w:val="16"/>
             </w:rPr>
             <w:alias w:val="#Nav: /Production_Order/AsofEndDate"/>
-            <w:tag w:val="#Nav: FS_YSD_InventoryValuationWIP/50008"/>
+            <w:tag w:val="#Nav: Inventory_Valuation_WIP/5802"/>
             <w:id w:val="2098753150"/>
             <w:placeholder>
               <w:docPart w:val="DefaultPlaceholder_-1854013440"/>
             </w:placeholder>
-            <w:dataBinding w:prefixMappings="xmlns:ns0='urn:microsoft-dynamics-nav/reports/FS_YSD_InventoryValuationWIP/50008/' " w:xpath="/ns0:NavWordReportXmlPart[1]/ns0:Production_Order[1]/ns0:AsofEndDate[1]" w:storeItemID="{3F37AC5C-CB25-4576-B933-8E34232D5829}"/>
+            <w:dataBinding w:prefixMappings="xmlns:ns0='urn:microsoft-dynamics-nav/reports/Inventory_Valuation_WIP/5802/'" w:xpath="/ns0:NavWordReportXmlPart[1]/ns0:Production_Order[1]/ns0:AsofEndDate[1]" w:storeItemID="{3F37AC5C-CB25-4576-B933-8E34232D5829}"/>
             <w:text/>
           </w:sdtPr>
           <w:sdtContent>
@@ -538,7 +539,7 @@
               <w:tcPr>
                 <w:tcW w:w="1701" w:type="dxa"/>
                 <w:tcBorders>
-                  <w:bottom w:val="single" w:sz="4" w:space="0" w:color="auto"/>
+                  <w:bottom w:val="single" w:color="auto" w:sz="4" w:space="0"/>
                 </w:tcBorders>
                 <w:vAlign w:val="bottom"/>
               </w:tcPr>
@@ -579,20 +580,20 @@
               <w:szCs w:val="16"/>
             </w:rPr>
             <w:alias w:val="#Nav: /Labels/CostPostedToGLLbl"/>
-            <w:tag w:val="#Nav: FS_YSD_InventoryValuationWIP/50008"/>
+            <w:tag w:val="#Nav: Inventory_Valuation_WIP/5802"/>
             <w:id w:val="-260611351"/>
             <w:placeholder>
               <w:docPart w:val="DefaultPlaceholder_-1854013440"/>
             </w:placeholder>
-            <w:dataBinding w:prefixMappings="xmlns:ns0='urn:microsoft-dynamics-nav/reports/FS_YSD_InventoryValuationWIP/50008/' " w:xpath="/ns0:NavWordReportXmlPart[1]/ns0:Labels[1]/ns0:CostPostedToGLLbl[1]" w:storeItemID="{3F37AC5C-CB25-4576-B933-8E34232D5829}"/>
+            <w:dataBinding w:prefixMappings="xmlns:ns0='urn:microsoft-dynamics-nav/reports/Inventory_Valuation_WIP/5802/'" w:xpath="/ns0:NavWordReportXmlPart[1]/ns0:Labels[1]/ns0:CostPostedToGLLbl[1]" w:storeItemID="{3F37AC5C-CB25-4576-B933-8E34232D5829}"/>
             <w:text/>
           </w:sdtPr>
           <w:sdtContent>
             <w:tc>
               <w:tcPr>
-                <w:tcW w:w="1790" w:type="dxa"/>
+                <w:tcW w:w="1282" w:type="dxa"/>
                 <w:tcBorders>
-                  <w:bottom w:val="single" w:sz="4" w:space="0" w:color="auto"/>
+                  <w:bottom w:val="single" w:color="auto" w:sz="4" w:space="0"/>
                 </w:tcBorders>
                 <w:vAlign w:val="bottom"/>
               </w:tcPr>
@@ -623,16 +624,47 @@
             </w:tc>
           </w:sdtContent>
         </w:sdt>
+        <w:tc>
+          <w:tcPr>
+            <w:tcW w:w="1276" w:type="dxa"/>
+            <w:tcBorders>
+              <w:bottom w:val="single" w:color="auto" w:sz="4" w:space="0"/>
+            </w:tcBorders>
+            <w:vAlign w:val="bottom"/>
+          </w:tcPr>
+          <w:p>
+            <w:pPr>
+              <w:jc w:val="right"/>
+              <w:rPr>
+                <w:rFonts w:ascii="Segoe UI" w:hAnsi="Segoe UI" w:cs="Segoe UI"/>
+                <w:b/>
+                <w:bCs/>
+                <w:sz w:val="16"/>
+                <w:szCs w:val="16"/>
+              </w:rPr>
+            </w:pPr>
+            <w:r>
+              <w:rPr>
+                <w:rFonts w:ascii="Segoe UI" w:hAnsi="Segoe UI" w:cs="Segoe UI"/>
+                <w:b/>
+                <w:bCs/>
+                <w:sz w:val="16"/>
+                <w:szCs w:val="16"/>
+              </w:rPr>
+              <w:t>Expensed WIP</w:t>
+            </w:r>
+          </w:p>
+        </w:tc>
       </w:tr>
       <w:tr>
         <w:trPr>
-          <w:trHeight w:hRule="exact" w:val="113"/>
+          <w:trHeight w:val="113" w:hRule="exact"/>
         </w:trPr>
         <w:tc>
           <w:tcPr>
             <w:tcW w:w="993" w:type="dxa"/>
             <w:tcBorders>
-              <w:top w:val="single" w:sz="4" w:space="0" w:color="auto"/>
+              <w:top w:val="single" w:color="auto" w:sz="4" w:space="0"/>
             </w:tcBorders>
           </w:tcPr>
           <w:p>
@@ -651,7 +683,7 @@
           <w:tcPr>
             <w:tcW w:w="850" w:type="dxa"/>
             <w:tcBorders>
-              <w:top w:val="single" w:sz="4" w:space="0" w:color="auto"/>
+              <w:top w:val="single" w:color="auto" w:sz="4" w:space="0"/>
             </w:tcBorders>
           </w:tcPr>
           <w:p>
@@ -668,9 +700,9 @@
         </w:tc>
         <w:tc>
           <w:tcPr>
-            <w:tcW w:w="2268" w:type="dxa"/>
+            <w:tcW w:w="1500" w:type="dxa"/>
             <w:tcBorders>
-              <w:top w:val="single" w:sz="4" w:space="0" w:color="auto"/>
+              <w:top w:val="single" w:color="auto" w:sz="4" w:space="0"/>
             </w:tcBorders>
           </w:tcPr>
           <w:p>
@@ -689,7 +721,7 @@
           <w:tcPr>
             <w:tcW w:w="1134" w:type="dxa"/>
             <w:tcBorders>
-              <w:top w:val="single" w:sz="4" w:space="0" w:color="auto"/>
+              <w:top w:val="single" w:color="auto" w:sz="4" w:space="0"/>
             </w:tcBorders>
           </w:tcPr>
           <w:p>
@@ -708,7 +740,7 @@
           <w:tcPr>
             <w:tcW w:w="1134" w:type="dxa"/>
             <w:tcBorders>
-              <w:top w:val="single" w:sz="4" w:space="0" w:color="auto"/>
+              <w:top w:val="single" w:color="auto" w:sz="4" w:space="0"/>
             </w:tcBorders>
           </w:tcPr>
           <w:p>
@@ -727,7 +759,7 @@
           <w:tcPr>
             <w:tcW w:w="1701" w:type="dxa"/>
             <w:tcBorders>
-              <w:top w:val="single" w:sz="4" w:space="0" w:color="auto"/>
+              <w:top w:val="single" w:color="auto" w:sz="4" w:space="0"/>
             </w:tcBorders>
           </w:tcPr>
           <w:p>
@@ -747,7 +779,7 @@
           <w:tcPr>
             <w:tcW w:w="1276" w:type="dxa"/>
             <w:tcBorders>
-              <w:top w:val="single" w:sz="4" w:space="0" w:color="auto"/>
+              <w:top w:val="single" w:color="auto" w:sz="4" w:space="0"/>
             </w:tcBorders>
           </w:tcPr>
           <w:p>
@@ -767,7 +799,7 @@
           <w:tcPr>
             <w:tcW w:w="1276" w:type="dxa"/>
             <w:tcBorders>
-              <w:top w:val="single" w:sz="4" w:space="0" w:color="auto"/>
+              <w:top w:val="single" w:color="auto" w:sz="4" w:space="0"/>
             </w:tcBorders>
           </w:tcPr>
           <w:p>
@@ -787,7 +819,7 @@
           <w:tcPr>
             <w:tcW w:w="1275" w:type="dxa"/>
             <w:tcBorders>
-              <w:top w:val="single" w:sz="4" w:space="0" w:color="auto"/>
+              <w:top w:val="single" w:color="auto" w:sz="4" w:space="0"/>
             </w:tcBorders>
           </w:tcPr>
           <w:p>
@@ -807,7 +839,7 @@
           <w:tcPr>
             <w:tcW w:w="1701" w:type="dxa"/>
             <w:tcBorders>
-              <w:top w:val="single" w:sz="4" w:space="0" w:color="auto"/>
+              <w:top w:val="single" w:color="auto" w:sz="4" w:space="0"/>
             </w:tcBorders>
           </w:tcPr>
           <w:p>
@@ -825,9 +857,29 @@
         </w:tc>
         <w:tc>
           <w:tcPr>
-            <w:tcW w:w="1790" w:type="dxa"/>
+            <w:tcW w:w="1282" w:type="dxa"/>
             <w:tcBorders>
-              <w:top w:val="single" w:sz="4" w:space="0" w:color="auto"/>
+              <w:top w:val="single" w:color="auto" w:sz="4" w:space="0"/>
+            </w:tcBorders>
+          </w:tcPr>
+          <w:p>
+            <w:pPr>
+              <w:jc w:val="right"/>
+              <w:rPr>
+                <w:rFonts w:ascii="Segoe UI" w:hAnsi="Segoe UI" w:cs="Segoe UI"/>
+                <w:b/>
+                <w:bCs/>
+                <w:sz w:val="16"/>
+                <w:szCs w:val="16"/>
+              </w:rPr>
+            </w:pPr>
+          </w:p>
+        </w:tc>
+        <w:tc>
+          <w:tcPr>
+            <w:tcW w:w="1276" w:type="dxa"/>
+            <w:tcBorders>
+              <w:top w:val="single" w:color="auto" w:sz="4" w:space="0"/>
             </w:tcBorders>
           </w:tcPr>
           <w:p>
@@ -852,9 +904,9 @@
             <w:szCs w:val="16"/>
           </w:rPr>
           <w:alias w:val="#Nav: /Production_Order"/>
-          <w:tag w:val="#Nav: FS_YSD_InventoryValuationWIP/50008"/>
+          <w:tag w:val="#Nav: Inventory_Valuation_WIP/5802"/>
           <w:id w:val="92147480"/>
-          <w15:dataBinding w:prefixMappings="xmlns:ns0='urn:microsoft-dynamics-nav/reports/FS_YSD_InventoryValuationWIP/50008/' " w:xpath="/ns0:NavWordReportXmlPart[1]/ns0:Production_Order" w:storeItemID="{3F37AC5C-CB25-4576-B933-8E34232D5829}"/>
+          <w15:dataBinding w:prefixMappings="xmlns:ns0='urn:microsoft-dynamics-nav/reports/Inventory_Valuation_WIP/5802/'" w:xpath="/ns0:NavWordReportXmlPart[1]/ns0:Production_Order" w:storeItemID="{3F37AC5C-CB25-4576-B933-8E34232D5829}"/>
           <w15:repeatingSection/>
         </w:sdtPr>
         <w:sdtContent>
@@ -874,7 +926,7 @@
             <w:sdtContent>
               <w:tr>
                 <w:trPr>
-                  <w:trHeight w:hRule="exact" w:val="227"/>
+                  <w:trHeight w:val="227" w:hRule="exact"/>
                 </w:trPr>
                 <w:sdt>
                   <w:sdtPr>
@@ -884,12 +936,12 @@
                       <w:szCs w:val="16"/>
                     </w:rPr>
                     <w:alias w:val="#Nav: /Production_Order/Status_ProductionOrder"/>
-                    <w:tag w:val="#Nav: FS_YSD_InventoryValuationWIP/50008"/>
+                    <w:tag w:val="#Nav: Inventory_Valuation_WIP/5802"/>
                     <w:id w:val="-607502289"/>
                     <w:placeholder>
                       <w:docPart w:val="E040F381EBA44E198CBB80FB543541F1"/>
                     </w:placeholder>
-                    <w:dataBinding w:prefixMappings="xmlns:ns0='urn:microsoft-dynamics-nav/reports/FS_YSD_InventoryValuationWIP/50008/' " w:xpath="/ns0:NavWordReportXmlPart[1]/ns0:Production_Order[1]/ns0:Status_ProductionOrder[1]" w:storeItemID="{3F37AC5C-CB25-4576-B933-8E34232D5829}"/>
+                    <w:dataBinding w:prefixMappings="xmlns:ns0='urn:microsoft-dynamics-nav/reports/Inventory_Valuation_WIP/5802/'" w:xpath="/ns0:NavWordReportXmlPart[1]/ns0:Production_Order[1]/ns0:Status_ProductionOrder[1]" w:storeItemID="{3F37AC5C-CB25-4576-B933-8E34232D5829}"/>
                     <w:text/>
                   </w:sdtPr>
                   <w:sdtContent>
@@ -927,12 +979,12 @@
                       <w:szCs w:val="16"/>
                     </w:rPr>
                     <w:alias w:val="#Nav: /Production_Order/No_ProductionOrder"/>
-                    <w:tag w:val="#Nav: FS_YSD_InventoryValuationWIP/50008"/>
+                    <w:tag w:val="#Nav: Inventory_Valuation_WIP/5802"/>
                     <w:id w:val="456909093"/>
                     <w:placeholder>
                       <w:docPart w:val="E040F381EBA44E198CBB80FB543541F1"/>
                     </w:placeholder>
-                    <w:dataBinding w:prefixMappings="xmlns:ns0='urn:microsoft-dynamics-nav/reports/FS_YSD_InventoryValuationWIP/50008/' " w:xpath="/ns0:NavWordReportXmlPart[1]/ns0:Production_Order[1]/ns0:No_ProductionOrder[1]" w:storeItemID="{3F37AC5C-CB25-4576-B933-8E34232D5829}"/>
+                    <w:dataBinding w:prefixMappings="xmlns:ns0='urn:microsoft-dynamics-nav/reports/Inventory_Valuation_WIP/5802/'" w:xpath="/ns0:NavWordReportXmlPart[1]/ns0:Production_Order[1]/ns0:No_ProductionOrder[1]" w:storeItemID="{3F37AC5C-CB25-4576-B933-8E34232D5829}"/>
                     <w:text/>
                   </w:sdtPr>
                   <w:sdtContent>
@@ -970,18 +1022,18 @@
                       <w:szCs w:val="16"/>
                     </w:rPr>
                     <w:alias w:val="#Nav: /Production_Order/Desc_ProductionOrder"/>
-                    <w:tag w:val="#Nav: FS_YSD_InventoryValuationWIP/50008"/>
+                    <w:tag w:val="#Nav: Inventory_Valuation_WIP/5802"/>
                     <w:id w:val="277606417"/>
                     <w:placeholder>
                       <w:docPart w:val="E040F381EBA44E198CBB80FB543541F1"/>
                     </w:placeholder>
-                    <w:dataBinding w:prefixMappings="xmlns:ns0='urn:microsoft-dynamics-nav/reports/FS_YSD_InventoryValuationWIP/50008/' " w:xpath="/ns0:NavWordReportXmlPart[1]/ns0:Production_Order[1]/ns0:Desc_ProductionOrder[1]" w:storeItemID="{3F37AC5C-CB25-4576-B933-8E34232D5829}"/>
+                    <w:dataBinding w:prefixMappings="xmlns:ns0='urn:microsoft-dynamics-nav/reports/Inventory_Valuation_WIP/5802/'" w:xpath="/ns0:NavWordReportXmlPart[1]/ns0:Production_Order[1]/ns0:Desc_ProductionOrder[1]" w:storeItemID="{3F37AC5C-CB25-4576-B933-8E34232D5829}"/>
                     <w:text/>
                   </w:sdtPr>
                   <w:sdtContent>
                     <w:tc>
                       <w:tcPr>
-                        <w:tcW w:w="2268" w:type="dxa"/>
+                        <w:tcW w:w="1500" w:type="dxa"/>
                       </w:tcPr>
                       <w:p>
                         <w:pPr>
@@ -1013,12 +1065,12 @@
                       <w:szCs w:val="16"/>
                     </w:rPr>
                     <w:alias w:val="#Nav: /Production_Order/SrcType_ProductionOrder"/>
-                    <w:tag w:val="#Nav: FS_YSD_InventoryValuationWIP/50008"/>
+                    <w:tag w:val="#Nav: Inventory_Valuation_WIP/5802"/>
                     <w:id w:val="1149251975"/>
                     <w:placeholder>
                       <w:docPart w:val="E040F381EBA44E198CBB80FB543541F1"/>
                     </w:placeholder>
-                    <w:dataBinding w:prefixMappings="xmlns:ns0='urn:microsoft-dynamics-nav/reports/FS_YSD_InventoryValuationWIP/50008/' " w:xpath="/ns0:NavWordReportXmlPart[1]/ns0:Production_Order[1]/ns0:SrcType_ProductionOrder[1]" w:storeItemID="{3F37AC5C-CB25-4576-B933-8E34232D5829}"/>
+                    <w:dataBinding w:prefixMappings="xmlns:ns0='urn:microsoft-dynamics-nav/reports/Inventory_Valuation_WIP/5802/'" w:xpath="/ns0:NavWordReportXmlPart[1]/ns0:Production_Order[1]/ns0:SrcType_ProductionOrder[1]" w:storeItemID="{3F37AC5C-CB25-4576-B933-8E34232D5829}"/>
                     <w:text/>
                   </w:sdtPr>
                   <w:sdtContent>
@@ -1056,12 +1108,12 @@
                       <w:szCs w:val="16"/>
                     </w:rPr>
                     <w:alias w:val="#Nav: /Production_Order/SourceNo_ProductionOrder"/>
-                    <w:tag w:val="#Nav: FS_YSD_InventoryValuationWIP/50008"/>
+                    <w:tag w:val="#Nav: Inventory_Valuation_WIP/5802"/>
                     <w:id w:val="-580903247"/>
                     <w:placeholder>
                       <w:docPart w:val="E040F381EBA44E198CBB80FB543541F1"/>
                     </w:placeholder>
-                    <w:dataBinding w:prefixMappings="xmlns:ns0='urn:microsoft-dynamics-nav/reports/FS_YSD_InventoryValuationWIP/50008/' " w:xpath="/ns0:NavWordReportXmlPart[1]/ns0:Production_Order[1]/ns0:SourceNo_ProductionOrder[1]" w:storeItemID="{3F37AC5C-CB25-4576-B933-8E34232D5829}"/>
+                    <w:dataBinding w:prefixMappings="xmlns:ns0='urn:microsoft-dynamics-nav/reports/Inventory_Valuation_WIP/5802/'" w:xpath="/ns0:NavWordReportXmlPart[1]/ns0:Production_Order[1]/ns0:SourceNo_ProductionOrder[1]" w:storeItemID="{3F37AC5C-CB25-4576-B933-8E34232D5829}"/>
                     <w:text/>
                   </w:sdtPr>
                   <w:sdtContent>
@@ -1099,12 +1151,12 @@
                       <w:szCs w:val="16"/>
                     </w:rPr>
                     <w:alias w:val="#Nav: /Production_Order/Value_Entry/LastWIP"/>
-                    <w:tag w:val="#Nav: FS_YSD_InventoryValuationWIP/50008"/>
+                    <w:tag w:val="#Nav: Inventory_Valuation_WIP/5802"/>
                     <w:id w:val="1057588485"/>
                     <w:placeholder>
                       <w:docPart w:val="E040F381EBA44E198CBB80FB543541F1"/>
                     </w:placeholder>
-                    <w:dataBinding w:prefixMappings="xmlns:ns0='urn:microsoft-dynamics-nav/reports/FS_YSD_InventoryValuationWIP/50008/' " w:xpath="/ns0:NavWordReportXmlPart[1]/ns0:Production_Order[1]/ns0:Value_Entry[1]/ns0:LastWIP[1]" w:storeItemID="{3F37AC5C-CB25-4576-B933-8E34232D5829}"/>
+                    <w:dataBinding w:prefixMappings="xmlns:ns0='urn:microsoft-dynamics-nav/reports/Inventory_Valuation_WIP/5802/'" w:xpath="/ns0:NavWordReportXmlPart[1]/ns0:Production_Order[1]/ns0:Value_Entry[1]/ns0:LastWIP[1]" w:storeItemID="{3F37AC5C-CB25-4576-B933-8E34232D5829}"/>
                     <w:text/>
                   </w:sdtPr>
                   <w:sdtContent>
@@ -1143,12 +1195,12 @@
                       <w:szCs w:val="16"/>
                     </w:rPr>
                     <w:alias w:val="#Nav: /Production_Order/Value_Entry/ValueOfMatConsump"/>
-                    <w:tag w:val="#Nav: FS_YSD_InventoryValuationWIP/50008"/>
+                    <w:tag w:val="#Nav: Inventory_Valuation_WIP/5802"/>
                     <w:id w:val="848141815"/>
                     <w:placeholder>
                       <w:docPart w:val="E040F381EBA44E198CBB80FB543541F1"/>
                     </w:placeholder>
-                    <w:dataBinding w:prefixMappings="xmlns:ns0='urn:microsoft-dynamics-nav/reports/FS_YSD_InventoryValuationWIP/50008/' " w:xpath="/ns0:NavWordReportXmlPart[1]/ns0:Production_Order[1]/ns0:Value_Entry[1]/ns0:ValueOfMatConsump[1]" w:storeItemID="{3F37AC5C-CB25-4576-B933-8E34232D5829}"/>
+                    <w:dataBinding w:prefixMappings="xmlns:ns0='urn:microsoft-dynamics-nav/reports/Inventory_Valuation_WIP/5802/'" w:xpath="/ns0:NavWordReportXmlPart[1]/ns0:Production_Order[1]/ns0:Value_Entry[1]/ns0:ValueOfMatConsump[1]" w:storeItemID="{3F37AC5C-CB25-4576-B933-8E34232D5829}"/>
                     <w:text/>
                   </w:sdtPr>
                   <w:sdtContent>
@@ -1187,12 +1239,12 @@
                       <w:szCs w:val="16"/>
                     </w:rPr>
                     <w:alias w:val="#Nav: /Production_Order/Value_Entry/ValueOfCap"/>
-                    <w:tag w:val="#Nav: FS_YSD_InventoryValuationWIP/50008"/>
+                    <w:tag w:val="#Nav: Inventory_Valuation_WIP/5802"/>
                     <w:id w:val="-1692063531"/>
                     <w:placeholder>
                       <w:docPart w:val="DefaultPlaceholder_-1854013440"/>
                     </w:placeholder>
-                    <w:dataBinding w:prefixMappings="xmlns:ns0='urn:microsoft-dynamics-nav/reports/FS_YSD_InventoryValuationWIP/50008/' " w:xpath="/ns0:NavWordReportXmlPart[1]/ns0:Production_Order[1]/ns0:Value_Entry[1]/ns0:ValueOfCap[1]" w:storeItemID="{3F37AC5C-CB25-4576-B933-8E34232D5829}"/>
+                    <w:dataBinding w:prefixMappings="xmlns:ns0='urn:microsoft-dynamics-nav/reports/Inventory_Valuation_WIP/5802/'" w:xpath="/ns0:NavWordReportXmlPart[1]/ns0:Production_Order[1]/ns0:Value_Entry[1]/ns0:ValueOfCap[1]" w:storeItemID="{3F37AC5C-CB25-4576-B933-8E34232D5829}"/>
                     <w:text/>
                   </w:sdtPr>
                   <w:sdtContent>
@@ -1228,12 +1280,12 @@
                       <w:szCs w:val="16"/>
                     </w:rPr>
                     <w:alias w:val="#Nav: /Production_Order/Value_Entry/ValueOfOutput"/>
-                    <w:tag w:val="#Nav: FS_YSD_InventoryValuationWIP/50008"/>
+                    <w:tag w:val="#Nav: Inventory_Valuation_WIP/5802"/>
                     <w:id w:val="1427304595"/>
                     <w:placeholder>
                       <w:docPart w:val="E040F381EBA44E198CBB80FB543541F1"/>
                     </w:placeholder>
-                    <w:dataBinding w:prefixMappings="xmlns:ns0='urn:microsoft-dynamics-nav/reports/FS_YSD_InventoryValuationWIP/50008/' " w:xpath="/ns0:NavWordReportXmlPart[1]/ns0:Production_Order[1]/ns0:Value_Entry[1]/ns0:ValueOfOutput[1]" w:storeItemID="{3F37AC5C-CB25-4576-B933-8E34232D5829}"/>
+                    <w:dataBinding w:prefixMappings="xmlns:ns0='urn:microsoft-dynamics-nav/reports/Inventory_Valuation_WIP/5802/'" w:xpath="/ns0:NavWordReportXmlPart[1]/ns0:Production_Order[1]/ns0:Value_Entry[1]/ns0:ValueOfOutput[1]" w:storeItemID="{3F37AC5C-CB25-4576-B933-8E34232D5829}"/>
                     <w:text/>
                   </w:sdtPr>
                   <w:sdtContent>
@@ -1274,12 +1326,12 @@
                       <w:szCs w:val="16"/>
                     </w:rPr>
                     <w:alias w:val="#Nav: /Production_Order/Value_Entry/AtLastDate"/>
-                    <w:tag w:val="#Nav: FS_YSD_InventoryValuationWIP/50008"/>
+                    <w:tag w:val="#Nav: Inventory_Valuation_WIP/5802"/>
                     <w:id w:val="104318586"/>
                     <w:placeholder>
                       <w:docPart w:val="E040F381EBA44E198CBB80FB543541F1"/>
                     </w:placeholder>
-                    <w:dataBinding w:prefixMappings="xmlns:ns0='urn:microsoft-dynamics-nav/reports/FS_YSD_InventoryValuationWIP/50008/' " w:xpath="/ns0:NavWordReportXmlPart[1]/ns0:Production_Order[1]/ns0:Value_Entry[1]/ns0:AtLastDate[1]" w:storeItemID="{3F37AC5C-CB25-4576-B933-8E34232D5829}"/>
+                    <w:dataBinding w:prefixMappings="xmlns:ns0='urn:microsoft-dynamics-nav/reports/Inventory_Valuation_WIP/5802/'" w:xpath="/ns0:NavWordReportXmlPart[1]/ns0:Production_Order[1]/ns0:Value_Entry[1]/ns0:AtLastDate[1]" w:storeItemID="{3F37AC5C-CB25-4576-B933-8E34232D5829}"/>
                     <w:text/>
                   </w:sdtPr>
                   <w:sdtContent>
@@ -1318,18 +1370,18 @@
                       <w:szCs w:val="16"/>
                     </w:rPr>
                     <w:alias w:val="#Nav: /Production_Order/Value_Entry/ValueEntryCostPostedtoGL"/>
-                    <w:tag w:val="#Nav: FS_YSD_InventoryValuationWIP/50008"/>
+                    <w:tag w:val="#Nav: Inventory_Valuation_WIP/5802"/>
                     <w:id w:val="1547330512"/>
                     <w:placeholder>
                       <w:docPart w:val="E040F381EBA44E198CBB80FB543541F1"/>
                     </w:placeholder>
-                    <w:dataBinding w:prefixMappings="xmlns:ns0='urn:microsoft-dynamics-nav/reports/FS_YSD_InventoryValuationWIP/50008/' " w:xpath="/ns0:NavWordReportXmlPart[1]/ns0:Production_Order[1]/ns0:Value_Entry[1]/ns0:ValueEntryCostPostedtoGL[1]" w:storeItemID="{3F37AC5C-CB25-4576-B933-8E34232D5829}"/>
+                    <w:dataBinding w:prefixMappings="xmlns:ns0='urn:microsoft-dynamics-nav/reports/Inventory_Valuation_WIP/5802/'" w:xpath="/ns0:NavWordReportXmlPart[1]/ns0:Production_Order[1]/ns0:Value_Entry[1]/ns0:ValueEntryCostPostedtoGL[1]" w:storeItemID="{3F37AC5C-CB25-4576-B933-8E34232D5829}"/>
                     <w:text/>
                   </w:sdtPr>
                   <w:sdtContent>
                     <w:tc>
                       <w:tcPr>
-                        <w:tcW w:w="1790" w:type="dxa"/>
+                        <w:tcW w:w="1282" w:type="dxa"/>
                       </w:tcPr>
                       <w:p>
                         <w:pPr>
@@ -1354,6 +1406,50 @@
                     </w:tc>
                   </w:sdtContent>
                 </w:sdt>
+                <w:sdt>
+                  <w:sdtPr>
+                    <w:rPr>
+                      <w:rFonts w:ascii="Segoe UI" w:hAnsi="Segoe UI" w:cs="Segoe UI"/>
+                      <w:sz w:val="16"/>
+                      <w:szCs w:val="16"/>
+                    </w:rPr>
+                    <w:alias w:val="#Nav: /Production_Order/Value_Entry/ExpensedWIP"/>
+                    <w:tag w:val="#Nav: Inventory_Valuation_WIP/5802"/>
+                    <w:id w:val="904318599"/>
+                    <w:placeholder>
+                      <w:docPart w:val="E040F381EBA44E198CBB80FB543541F1"/>
+                    </w:placeholder>
+                    <w:dataBinding w:prefixMappings="xmlns:ns0='urn:microsoft-dynamics-nav/reports/Inventory_Valuation_WIP/5802/'" w:xpath="/ns0:NavWordReportXmlPart[1]/ns0:Production_Order[1]/ns0:Value_Entry[1]/ns0:ExpensedWIP[1]" w:storeItemID="{3F37AC5C-CB25-4576-B933-8E34232D5829}"/>
+                    <w:text/>
+                  </w:sdtPr>
+                  <w:sdtContent>
+                    <w:tc>
+                      <w:tcPr>
+                        <w:tcW w:w="1276" w:type="dxa"/>
+                      </w:tcPr>
+                      <w:p>
+                        <w:pPr>
+                          <w:jc w:val="right"/>
+                          <w:rPr>
+                            <w:rFonts w:ascii="Segoe UI" w:hAnsi="Segoe UI" w:cs="Segoe UI"/>
+                            <w:sz w:val="16"/>
+                            <w:szCs w:val="16"/>
+                          </w:rPr>
+                        </w:pPr>
+                        <w:proofErr w:type="spellStart"/>
+                        <w:r>
+                          <w:rPr>
+                            <w:rFonts w:ascii="Segoe UI" w:hAnsi="Segoe UI" w:cs="Segoe UI"/>
+                            <w:sz w:val="16"/>
+                            <w:szCs w:val="16"/>
+                          </w:rPr>
+                          <w:t>ExpensedWIP</w:t>
+                        </w:r>
+                        <w:proofErr w:type="spellEnd"/>
+                      </w:p>
+                    </w:tc>
+                  </w:sdtContent>
+                </w:sdt>
               </w:tr>
             </w:sdtContent>
           </w:sdt>
@@ -1361,7 +1457,7 @@
       </w:sdt>
       <w:tr>
         <w:trPr>
-          <w:trHeight w:hRule="exact" w:val="170"/>
+          <w:trHeight w:val="170" w:hRule="exact"/>
         </w:trPr>
         <w:tc>
           <w:tcPr>
@@ -1393,7 +1489,7 @@
         </w:tc>
         <w:tc>
           <w:tcPr>
-            <w:tcW w:w="2268" w:type="dxa"/>
+            <w:tcW w:w="1500" w:type="dxa"/>
           </w:tcPr>
           <w:p>
             <w:pPr>
@@ -1437,7 +1533,7 @@
           <w:tcPr>
             <w:tcW w:w="1701" w:type="dxa"/>
             <w:tcBorders>
-              <w:bottom w:val="single" w:sz="4" w:space="0" w:color="auto"/>
+              <w:bottom w:val="single" w:color="auto" w:sz="4" w:space="0"/>
             </w:tcBorders>
           </w:tcPr>
           <w:p>
@@ -1455,7 +1551,7 @@
           <w:tcPr>
             <w:tcW w:w="1276" w:type="dxa"/>
             <w:tcBorders>
-              <w:bottom w:val="single" w:sz="4" w:space="0" w:color="auto"/>
+              <w:bottom w:val="single" w:color="auto" w:sz="4" w:space="0"/>
             </w:tcBorders>
           </w:tcPr>
           <w:p>
@@ -1473,7 +1569,7 @@
           <w:tcPr>
             <w:tcW w:w="1276" w:type="dxa"/>
             <w:tcBorders>
-              <w:bottom w:val="single" w:sz="4" w:space="0" w:color="auto"/>
+              <w:bottom w:val="single" w:color="auto" w:sz="4" w:space="0"/>
             </w:tcBorders>
           </w:tcPr>
           <w:p>
@@ -1491,7 +1587,7 @@
           <w:tcPr>
             <w:tcW w:w="1275" w:type="dxa"/>
             <w:tcBorders>
-              <w:bottom w:val="single" w:sz="4" w:space="0" w:color="auto"/>
+              <w:bottom w:val="single" w:color="auto" w:sz="4" w:space="0"/>
             </w:tcBorders>
           </w:tcPr>
           <w:p>
@@ -1509,7 +1605,7 @@
           <w:tcPr>
             <w:tcW w:w="1701" w:type="dxa"/>
             <w:tcBorders>
-              <w:bottom w:val="single" w:sz="4" w:space="0" w:color="auto"/>
+              <w:bottom w:val="single" w:color="auto" w:sz="4" w:space="0"/>
             </w:tcBorders>
           </w:tcPr>
           <w:p>
@@ -1525,9 +1621,27 @@
         </w:tc>
         <w:tc>
           <w:tcPr>
-            <w:tcW w:w="1790" w:type="dxa"/>
+            <w:tcW w:w="1282" w:type="dxa"/>
             <w:tcBorders>
-              <w:bottom w:val="single" w:sz="4" w:space="0" w:color="auto"/>
+              <w:bottom w:val="single" w:color="auto" w:sz="4" w:space="0"/>
+            </w:tcBorders>
+          </w:tcPr>
+          <w:p>
+            <w:pPr>
+              <w:jc w:val="right"/>
+              <w:rPr>
+                <w:rFonts w:ascii="Segoe UI" w:hAnsi="Segoe UI" w:cs="Segoe UI"/>
+                <w:sz w:val="16"/>
+                <w:szCs w:val="16"/>
+              </w:rPr>
+            </w:pPr>
+          </w:p>
+        </w:tc>
+        <w:tc>
+          <w:tcPr>
+            <w:tcW w:w="1276" w:type="dxa"/>
+            <w:tcBorders>
+              <w:bottom w:val="single" w:color="auto" w:sz="4" w:space="0"/>
             </w:tcBorders>
           </w:tcPr>
           <w:p>
@@ -1578,7 +1692,7 @@
         </w:tc>
         <w:tc>
           <w:tcPr>
-            <w:tcW w:w="2268" w:type="dxa"/>
+            <w:tcW w:w="1500" w:type="dxa"/>
           </w:tcPr>
           <w:p>
             <w:pPr>
@@ -1614,12 +1728,12 @@
               <w:szCs w:val="16"/>
             </w:rPr>
             <w:alias w:val="#Nav: /Labels/TotalLbl"/>
-            <w:tag w:val="#Nav: FS_YSD_InventoryValuationWIP/50008"/>
+            <w:tag w:val="#Nav: Inventory_Valuation_WIP/5802"/>
             <w:id w:val="-1695217765"/>
             <w:placeholder>
               <w:docPart w:val="BEDE1E60B689436D9B3724EECF5B86FB"/>
             </w:placeholder>
-            <w:dataBinding w:prefixMappings="xmlns:ns0='urn:microsoft-dynamics-nav/reports/FS_YSD_InventoryValuationWIP/50008/' " w:xpath="/ns0:NavWordReportXmlPart[1]/ns0:Labels[1]/ns0:TotalLbl[1]" w:storeItemID="{3F37AC5C-CB25-4576-B933-8E34232D5829}"/>
+            <w:dataBinding w:prefixMappings="xmlns:ns0='urn:microsoft-dynamics-nav/reports/Inventory_Valuation_WIP/5802/'" w:xpath="/ns0:NavWordReportXmlPart[1]/ns0:Labels[1]/ns0:TotalLbl[1]" w:storeItemID="{3F37AC5C-CB25-4576-B933-8E34232D5829}"/>
             <w:text/>
           </w:sdtPr>
           <w:sdtContent>
@@ -1668,15 +1782,17 @@
             <w:placeholder>
               <w:docPart w:val="DefaultPlaceholder_-1854013440"/>
             </w:placeholder>
-            <w:dataBinding w:prefixMappings="xmlns:ns0='urn:microsoft-dynamics-nav/reports/FS_YSD_InventoryValuationWIP/50008/' " w:xpath="/ns0:NavWordReportXmlPart[1]/ns0:Totals[1]/ns0:LatWipSum[1]" w:storeItemID="{3F37AC5C-CB25-4576-B933-8E34232D5829}"/>
+            <w:dataBinding w:prefixMappings="xmlns:ns0='urn:microsoft-dynamics-nav/reports/Inventory_Valuation_WIP/5802/'" w:xpath="/ns0:NavWordReportXmlPart[1]/ns0:Totals[1]/ns0:LatWipSum[1]" w:storeItemID="{3F37AC5C-CB25-4576-B933-8E34232D5829}"/>
             <w:text/>
+            <w:alias w:val="#Nav: /Totals/LatWipSum"/>
+            <w:tag w:val="#Nav: Inventory_Valuation_WIP/5802"/>
           </w:sdtPr>
           <w:sdtContent>
             <w:tc>
               <w:tcPr>
                 <w:tcW w:w="1701" w:type="dxa"/>
                 <w:tcBorders>
-                  <w:top w:val="single" w:sz="4" w:space="0" w:color="auto"/>
+                  <w:top w:val="single" w:color="auto" w:sz="4" w:space="0"/>
                 </w:tcBorders>
                 <w:vAlign w:val="center"/>
               </w:tcPr>
@@ -1717,12 +1833,12 @@
               <w:szCs w:val="16"/>
             </w:rPr>
             <w:alias w:val="#Nav: /Totals/ValueOfMatConsumptionSum"/>
-            <w:tag w:val="#Nav: FS_YSD_InventoryValuationWIP/50008"/>
+            <w:tag w:val="#Nav: Inventory_Valuation_WIP/5802"/>
             <w:id w:val="2027518821"/>
             <w:placeholder>
               <w:docPart w:val="DefaultPlaceholder_-1854013440"/>
             </w:placeholder>
-            <w:dataBinding w:prefixMappings="xmlns:ns0='urn:microsoft-dynamics-nav/reports/FS_YSD_InventoryValuationWIP/50008/' " w:xpath="/ns0:NavWordReportXmlPart[1]/ns0:Totals[1]/ns0:ValueOfMatConsumptionSum[1]" w:storeItemID="{3F37AC5C-CB25-4576-B933-8E34232D5829}"/>
+            <w:dataBinding w:prefixMappings="xmlns:ns0='urn:microsoft-dynamics-nav/reports/Inventory_Valuation_WIP/5802/'" w:xpath="/ns0:NavWordReportXmlPart[1]/ns0:Totals[1]/ns0:ValueOfMatConsumptionSum[1]" w:storeItemID="{3F37AC5C-CB25-4576-B933-8E34232D5829}"/>
             <w:text/>
           </w:sdtPr>
           <w:sdtContent>
@@ -1730,7 +1846,7 @@
               <w:tcPr>
                 <w:tcW w:w="1276" w:type="dxa"/>
                 <w:tcBorders>
-                  <w:top w:val="single" w:sz="4" w:space="0" w:color="auto"/>
+                  <w:top w:val="single" w:color="auto" w:sz="4" w:space="0"/>
                 </w:tcBorders>
                 <w:vAlign w:val="center"/>
               </w:tcPr>
@@ -1771,12 +1887,12 @@
               <w:szCs w:val="16"/>
             </w:rPr>
             <w:alias w:val="#Nav: /Totals/ValueOfCapSum"/>
-            <w:tag w:val="#Nav: FS_YSD_InventoryValuationWIP/50008"/>
+            <w:tag w:val="#Nav: Inventory_Valuation_WIP/5802"/>
             <w:id w:val="-461496571"/>
             <w:placeholder>
               <w:docPart w:val="DefaultPlaceholder_-1854013440"/>
             </w:placeholder>
-            <w:dataBinding w:prefixMappings="xmlns:ns0='urn:microsoft-dynamics-nav/reports/FS_YSD_InventoryValuationWIP/50008/' " w:xpath="/ns0:NavWordReportXmlPart[1]/ns0:Totals[1]/ns0:ValueOfCapSum[1]" w:storeItemID="{3F37AC5C-CB25-4576-B933-8E34232D5829}"/>
+            <w:dataBinding w:prefixMappings="xmlns:ns0='urn:microsoft-dynamics-nav/reports/Inventory_Valuation_WIP/5802/'" w:xpath="/ns0:NavWordReportXmlPart[1]/ns0:Totals[1]/ns0:ValueOfCapSum[1]" w:storeItemID="{3F37AC5C-CB25-4576-B933-8E34232D5829}"/>
             <w:text/>
           </w:sdtPr>
           <w:sdtContent>
@@ -1784,7 +1900,7 @@
               <w:tcPr>
                 <w:tcW w:w="1276" w:type="dxa"/>
                 <w:tcBorders>
-                  <w:top w:val="single" w:sz="4" w:space="0" w:color="auto"/>
+                  <w:top w:val="single" w:color="auto" w:sz="4" w:space="0"/>
                 </w:tcBorders>
                 <w:vAlign w:val="center"/>
               </w:tcPr>
@@ -1825,12 +1941,12 @@
               <w:szCs w:val="16"/>
             </w:rPr>
             <w:alias w:val="#Nav: /Totals/ValueOfOutputSum"/>
-            <w:tag w:val="#Nav: FS_YSD_InventoryValuationWIP/50008"/>
+            <w:tag w:val="#Nav: Inventory_Valuation_WIP/5802"/>
             <w:id w:val="1208917579"/>
             <w:placeholder>
               <w:docPart w:val="DefaultPlaceholder_-1854013440"/>
             </w:placeholder>
-            <w:dataBinding w:prefixMappings="xmlns:ns0='urn:microsoft-dynamics-nav/reports/FS_YSD_InventoryValuationWIP/50008/' " w:xpath="/ns0:NavWordReportXmlPart[1]/ns0:Totals[1]/ns0:ValueOfOutputSum[1]" w:storeItemID="{3F37AC5C-CB25-4576-B933-8E34232D5829}"/>
+            <w:dataBinding w:prefixMappings="xmlns:ns0='urn:microsoft-dynamics-nav/reports/Inventory_Valuation_WIP/5802/'" w:xpath="/ns0:NavWordReportXmlPart[1]/ns0:Totals[1]/ns0:ValueOfOutputSum[1]" w:storeItemID="{3F37AC5C-CB25-4576-B933-8E34232D5829}"/>
             <w:text/>
           </w:sdtPr>
           <w:sdtContent>
@@ -1838,7 +1954,7 @@
               <w:tcPr>
                 <w:tcW w:w="1275" w:type="dxa"/>
                 <w:tcBorders>
-                  <w:top w:val="single" w:sz="4" w:space="0" w:color="auto"/>
+                  <w:top w:val="single" w:color="auto" w:sz="4" w:space="0"/>
                 </w:tcBorders>
                 <w:vAlign w:val="center"/>
               </w:tcPr>
@@ -1879,12 +1995,12 @@
               <w:szCs w:val="16"/>
             </w:rPr>
             <w:alias w:val="#Nav: /Totals/AtLastDateSum"/>
-            <w:tag w:val="#Nav: FS_YSD_InventoryValuationWIP/50008"/>
+            <w:tag w:val="#Nav: Inventory_Valuation_WIP/5802"/>
             <w:id w:val="1189640463"/>
             <w:placeholder>
               <w:docPart w:val="DefaultPlaceholder_-1854013440"/>
             </w:placeholder>
-            <w:dataBinding w:prefixMappings="xmlns:ns0='urn:microsoft-dynamics-nav/reports/FS_YSD_InventoryValuationWIP/50008/' " w:xpath="/ns0:NavWordReportXmlPart[1]/ns0:Totals[1]/ns0:AtLastDateSum[1]" w:storeItemID="{3F37AC5C-CB25-4576-B933-8E34232D5829}"/>
+            <w:dataBinding w:prefixMappings="xmlns:ns0='urn:microsoft-dynamics-nav/reports/Inventory_Valuation_WIP/5802/'" w:xpath="/ns0:NavWordReportXmlPart[1]/ns0:Totals[1]/ns0:AtLastDateSum[1]" w:storeItemID="{3F37AC5C-CB25-4576-B933-8E34232D5829}"/>
             <w:text/>
           </w:sdtPr>
           <w:sdtContent>
@@ -1892,7 +2008,7 @@
               <w:tcPr>
                 <w:tcW w:w="1701" w:type="dxa"/>
                 <w:tcBorders>
-                  <w:top w:val="single" w:sz="4" w:space="0" w:color="auto"/>
+                  <w:top w:val="single" w:color="auto" w:sz="4" w:space="0"/>
                 </w:tcBorders>
                 <w:vAlign w:val="center"/>
               </w:tcPr>
@@ -1933,20 +2049,20 @@
               <w:szCs w:val="16"/>
             </w:rPr>
             <w:alias w:val="#Nav: /Totals/ValueEntryCostPostedToGLSum"/>
-            <w:tag w:val="#Nav: FS_YSD_InventoryValuationWIP/50008"/>
+            <w:tag w:val="#Nav: Inventory_Valuation_WIP/5802"/>
             <w:id w:val="-1751268314"/>
             <w:placeholder>
               <w:docPart w:val="DefaultPlaceholder_-1854013440"/>
             </w:placeholder>
-            <w:dataBinding w:prefixMappings="xmlns:ns0='urn:microsoft-dynamics-nav/reports/FS_YSD_InventoryValuationWIP/50008/' " w:xpath="/ns0:NavWordReportXmlPart[1]/ns0:Totals[1]/ns0:ValueEntryCostPostedToGLSum[1]" w:storeItemID="{3F37AC5C-CB25-4576-B933-8E34232D5829}"/>
+            <w:dataBinding w:prefixMappings="xmlns:ns0='urn:microsoft-dynamics-nav/reports/Inventory_Valuation_WIP/5802/'" w:xpath="/ns0:NavWordReportXmlPart[1]/ns0:Totals[1]/ns0:ValueEntryCostPostedToGLSum[1]" w:storeItemID="{3F37AC5C-CB25-4576-B933-8E34232D5829}"/>
             <w:text/>
           </w:sdtPr>
           <w:sdtContent>
             <w:tc>
               <w:tcPr>
-                <w:tcW w:w="1790" w:type="dxa"/>
+                <w:tcW w:w="1282" w:type="dxa"/>
                 <w:tcBorders>
-                  <w:top w:val="single" w:sz="4" w:space="0" w:color="auto"/>
+                  <w:top w:val="single" w:color="auto" w:sz="4" w:space="0"/>
                 </w:tcBorders>
                 <w:vAlign w:val="center"/>
               </w:tcPr>
@@ -1971,6 +2087,60 @@
                     <w:szCs w:val="16"/>
                   </w:rPr>
                   <w:t>ValueEntryCostPostedToGLSum</w:t>
+                </w:r>
+                <w:proofErr w:type="spellEnd"/>
+              </w:p>
+            </w:tc>
+          </w:sdtContent>
+        </w:sdt>
+        <w:sdt>
+          <w:sdtPr>
+            <w:rPr>
+              <w:rFonts w:ascii="Segoe UI" w:hAnsi="Segoe UI" w:cs="Segoe UI"/>
+              <w:b/>
+              <w:bCs/>
+              <w:sz w:val="16"/>
+              <w:szCs w:val="16"/>
+            </w:rPr>
+            <w:alias w:val="#Nav: /Totals/ExpensedWIPSum"/>
+            <w:tag w:val="#Nav: Inventory_Valuation_WIP/5802"/>
+            <w:id w:val="918964077"/>
+            <w:placeholder>
+              <w:docPart w:val="DefaultPlaceholder_-1854013440"/>
+            </w:placeholder>
+            <w:dataBinding w:prefixMappings="xmlns:ns0='urn:microsoft-dynamics-nav/reports/Inventory_Valuation_WIP/5802/'" w:xpath="/ns0:NavWordReportXmlPart[1]/ns0:Totals[1]/ns0:ExpensedWIPSum[1]" w:storeItemID="{3F37AC5C-CB25-4576-B933-8E34232D5829}"/>
+            <w:text/>
+          </w:sdtPr>
+          <w:sdtContent>
+            <w:tc>
+              <w:tcPr>
+                <w:tcW w:w="1276" w:type="dxa"/>
+                <w:tcBorders>
+                  <w:top w:val="single" w:color="auto" w:sz="4" w:space="0"/>
+                </w:tcBorders>
+                <w:vAlign w:val="center"/>
+              </w:tcPr>
+              <w:p>
+                <w:pPr>
+                  <w:jc w:val="right"/>
+                  <w:rPr>
+                    <w:rFonts w:ascii="Segoe UI" w:hAnsi="Segoe UI" w:cs="Segoe UI"/>
+                    <w:b/>
+                    <w:bCs/>
+                    <w:sz w:val="16"/>
+                    <w:szCs w:val="16"/>
+                  </w:rPr>
+                </w:pPr>
+                <w:proofErr w:type="spellStart"/>
+                <w:r>
+                  <w:rPr>
+                    <w:rFonts w:ascii="Segoe UI" w:hAnsi="Segoe UI" w:cs="Segoe UI"/>
+                    <w:b/>
+                    <w:bCs/>
+                    <w:sz w:val="16"/>
+                    <w:szCs w:val="16"/>
+                  </w:rPr>
+                  <w:t>ExpensedWIPSum</w:t>
                 </w:r>
                 <w:proofErr w:type="spellEnd"/>
               </w:p>
@@ -2052,12 +2222,12 @@
       <w:tblStyle w:val="TableGrid"/>
       <w:tblW w:w="15400" w:type="dxa"/>
       <w:tblBorders>
-        <w:top w:val="none" w:sz="0" w:space="0" w:color="auto"/>
-        <w:left w:val="none" w:sz="0" w:space="0" w:color="auto"/>
-        <w:bottom w:val="none" w:sz="0" w:space="0" w:color="auto"/>
-        <w:right w:val="none" w:sz="0" w:space="0" w:color="auto"/>
-        <w:insideH w:val="none" w:sz="0" w:space="0" w:color="auto"/>
-        <w:insideV w:val="none" w:sz="0" w:space="0" w:color="auto"/>
+        <w:top w:val="none" w:color="auto" w:sz="0" w:space="0"/>
+        <w:left w:val="none" w:color="auto" w:sz="0" w:space="0"/>
+        <w:bottom w:val="none" w:color="auto" w:sz="0" w:space="0"/>
+        <w:right w:val="none" w:color="auto" w:sz="0" w:space="0"/>
+        <w:insideH w:val="none" w:color="auto" w:sz="0" w:space="0"/>
+        <w:insideV w:val="none" w:color="auto" w:sz="0" w:space="0"/>
       </w:tblBorders>
       <w:tblLook w:val="04A0" w:firstRow="1" w:lastRow="0" w:firstColumn="1" w:lastColumn="0" w:noHBand="0" w:noVBand="1"/>
     </w:tblPr>
@@ -2080,12 +2250,12 @@
               <w:szCs w:val="28"/>
             </w:rPr>
             <w:alias w:val="#Nav: /Labels/ProdOrderWIPLbl"/>
-            <w:tag w:val="#Nav: FS_YSD_InventoryValuationWIP/50008"/>
+            <w:tag w:val="#Nav: Inventory_Valuation_WIP/5802"/>
             <w:id w:val="285010964"/>
             <w:placeholder>
               <w:docPart w:val="DefaultPlaceholder_-1854013440"/>
             </w:placeholder>
-            <w:dataBinding w:prefixMappings="xmlns:ns0='urn:microsoft-dynamics-nav/reports/FS_YSD_InventoryValuationWIP/50008/' " w:xpath="/ns0:NavWordReportXmlPart[1]/ns0:Labels[1]/ns0:ProdOrderWIPLbl[1]" w:storeItemID="{3F37AC5C-CB25-4576-B933-8E34232D5829}"/>
+            <w:dataBinding w:prefixMappings="xmlns:ns0='urn:microsoft-dynamics-nav/reports/Inventory_Valuation_WIP/5802/'" w:xpath="/ns0:NavWordReportXmlPart[1]/ns0:Labels[1]/ns0:ProdOrderWIPLbl[1]" w:storeItemID="{3F37AC5C-CB25-4576-B933-8E34232D5829}"/>
             <w:text/>
           </w:sdtPr>
           <w:sdtContent>
@@ -2305,12 +2475,12 @@
                 <w:szCs w:val="16"/>
               </w:rPr>
               <w:alias w:val="#Nav: /BCReportInformation/ReportRequest/UserName"/>
-              <w:tag w:val="#Nav: FS_YSD_InventoryValuationWIP/50008"/>
+              <w:tag w:val="#Nav: Inventory_Valuation_WIP/5802"/>
               <w:id w:val="-249272221"/>
               <w:placeholder>
                 <w:docPart w:val="3D8F3EE94B464D7880E07DC3EB1B233A"/>
               </w:placeholder>
-              <w:dataBinding w:prefixMappings="xmlns:ns0='urn:microsoft-dynamics-nav/reports/FS_YSD_InventoryValuationWIP/50008/'" w:xpath="/ns0:NavWordReportXmlPart[1]/ns0:BCReportInformation[1]/ns0:ReportRequest[1]/ns0:UserName[1]" w:storeItemID="{3F37AC5C-CB25-4576-B933-8E34232D5829}"/>
+              <w:dataBinding w:prefixMappings="xmlns:ns0='urn:microsoft-dynamics-nav/reports/Inventory_Valuation_WIP/5802/'" w:xpath="/ns0:NavWordReportXmlPart[1]/ns0:BCReportInformation[1]/ns0:ReportRequest[1]/ns0:UserName[1]" w:storeItemID="{3F37AC5C-CB25-4576-B933-8E34232D5829}"/>
               <w:text/>
             </w:sdtPr>
             <w:sdtContent>
@@ -2346,12 +2516,12 @@
             <w:szCs w:val="16"/>
           </w:rPr>
           <w:alias w:val="#Nav: /BCReportInformation/ReportRequest/CompanyName"/>
-          <w:tag w:val="#Nav: FS_YSD_InventoryValuationWIP/50008"/>
+          <w:tag w:val="#Nav: Inventory_Valuation_WIP/5802"/>
           <w:id w:val="-1641258246"/>
           <w:placeholder>
             <w:docPart w:val="B954294AB2D64F9A9088EE7BF7427E78"/>
           </w:placeholder>
-          <w:dataBinding w:prefixMappings="xmlns:ns0='urn:microsoft-dynamics-nav/reports/FS_YSD_InventoryValuationWIP/50008/'" w:xpath="/ns0:NavWordReportXmlPart[1]/ns0:BCReportInformation[1]/ns0:ReportRequest[1]/ns0:CompanyName[1]" w:storeItemID="{3F37AC5C-CB25-4576-B933-8E34232D5829}"/>
+          <w:dataBinding w:prefixMappings="xmlns:ns0='urn:microsoft-dynamics-nav/reports/Inventory_Valuation_WIP/5802/'" w:xpath="/ns0:NavWordReportXmlPart[1]/ns0:BCReportInformation[1]/ns0:ReportRequest[1]/ns0:CompanyName[1]" w:storeItemID="{3F37AC5C-CB25-4576-B933-8E34232D5829}"/>
           <w:text/>
         </w:sdtPr>
         <w:sdtContent>
@@ -2395,12 +2565,12 @@
             <w:szCs w:val="16"/>
           </w:rPr>
           <w:alias w:val="#Nav: /Production_Order/ProdOrderFilter"/>
-          <w:tag w:val="#Nav: FS_YSD_InventoryValuationWIP/50008"/>
+          <w:tag w:val="#Nav: Inventory_Valuation_WIP/5802"/>
           <w:id w:val="2087638137"/>
           <w:placeholder>
             <w:docPart w:val="DefaultPlaceholder_-1854013440"/>
           </w:placeholder>
-          <w:dataBinding w:prefixMappings="xmlns:ns0='urn:microsoft-dynamics-nav/reports/FS_YSD_InventoryValuationWIP/50008/' " w:xpath="/ns0:NavWordReportXmlPart[1]/ns0:Production_Order[1]/ns0:ProdOrderFilter[1]" w:storeItemID="{3F37AC5C-CB25-4576-B933-8E34232D5829}"/>
+          <w:dataBinding w:prefixMappings="xmlns:ns0='urn:microsoft-dynamics-nav/reports/Inventory_Valuation_WIP/5802/'" w:xpath="/ns0:NavWordReportXmlPart[1]/ns0:Production_Order[1]/ns0:ProdOrderFilter[1]" w:storeItemID="{3F37AC5C-CB25-4576-B933-8E34232D5829}"/>
           <w:text/>
         </w:sdtPr>
         <w:sdtContent>
@@ -2444,7 +2614,7 @@
     </w:tr>
     <w:tr>
       <w:trPr>
-        <w:trHeight w:hRule="exact" w:val="198"/>
+        <w:trHeight w:val="198" w:hRule="exact"/>
       </w:trPr>
       <w:tc>
         <w:tcPr>
@@ -4271,7 +4441,9 @@
 <b:Sources xmlns:b="http://schemas.openxmlformats.org/officeDocument/2006/bibliography" xmlns="http://schemas.openxmlformats.org/officeDocument/2006/bibliography" SelectedStyle="\APASixthEditionOfficeOnline.xsl" StyleName="APA" Version="6"/>
 </file>
 
-<file path=customXml/item2.xml>��< ? x m l   v e r s i o n = " 1 . 0 "   e n c o d i n g = " u t f - 1 6 " ? > < N a v W o r d R e p o r t X m l P a r t   x m l n s = " u r n : m i c r o s o f t - d y n a m i c s - n a v / r e p o r t s / F S _ Y S D _ I n v e n t o r y V a l u a t i o n W I P / 5 0 0 0 8 / " > +<file path=customXml/item3.xml>��< ? x m l   v e r s i o n = " 1 . 0 "   e n c o d i n g = " u t f - 1 6 " ? > + 
+ < N a v W o r d R e p o r t X m l P a r t   x m l n s = " u r n : m i c r o s o f t - d y n a m i c s - n a v / r e p o r t s / I n v e n t o r y _ V a l u a t i o n _ W I P / 5 8 0 2 / " >   
      < B C R e p o r t I n f o r m a t i o n >   
@@ -4335,6 +4507,84 @@
  
          < / R e p o r t R e q u e s t >   
+         < C o m p a n y M e t a d a t a > + 
+             < C o m p a n y N a m e > C o m p a n y   N a m e < / C o m p a n y N a m e > + 
+             < C o m p a n y D i s p l a y N a m e > C o m p a n y   D i s p l a y   N a m e < / C o m p a n y D i s p l a y N a m e > + 
+             < C o m p a n y A d d r e s s L i n e s > + 
+                 < C o m p a n y A d d r e s s L i n e > C o m p a n y   A d d r e s s   L i n e   1 < / C o m p a n y A d d r e s s L i n e > + 
+                 < C o m p a n y A d d r e s s L i n e > C o m p a n y   A d d r e s s   L i n e   2 < / C o m p a n y A d d r e s s L i n e > + 
+                 < C o m p a n y A d d r e s s L i n e > C o m p a n y   A d d r e s s   L i n e   3 < / C o m p a n y A d d r e s s L i n e > + 
+                 < C o m p a n y A d d r e s s L i n e > C o m p a n y   A d d r e s s   L i n e   4 < / C o m p a n y A d d r e s s L i n e > + 
+                 < C o m p a n y A d d r e s s L i n e > C o m p a n y   A d d r e s s   L i n e   5 < / C o m p a n y A d d r e s s L i n e > + 
+                 < C o m p a n y A d d r e s s L i n e > C o m p a n y   A d d r e s s   L i n e   6 < / C o m p a n y A d d r e s s L i n e > + 
+                 < C o m p a n y A d d r e s s L i n e > C o m p a n y   A d d r e s s   L i n e   7 < / C o m p a n y A d d r e s s L i n e > + 
+                 < C o m p a n y A d d r e s s L i n e > C o m p a n y   A d d r e s s   L i n e   8 < / C o m p a n y A d d r e s s L i n e > + 
+             < / C o m p a n y A d d r e s s L i n e s > + 
+             < C o m p a n y P h o n e > C o m p a n y   P h o n e < / C o m p a n y P h o n e > + 
+             < C o m p a n y P h o n e C a p t i o n > C o m p a n y   P h o n e   C a p t i o n < / C o m p a n y P h o n e C a p t i o n > + 
+             < C o m p a n y F a x N o > C o m p a n y   F a x   N o . < / C o m p a n y F a x N o > + 
+             < C o m p a n y F a x N o C a p t i o n > C o m p a n y   F a x   N o .   C a p t i o n < / C o m p a n y F a x N o C a p t i o n > + 
+             < C o m p a n y E m a i l > C o m p a n y   E m a i l < / C o m p a n y E m a i l > + 
+             < C o m p a n y E m a i l C a p t i o n > C o m p a n y   E m a i l   C a p t i o n < / C o m p a n y E m a i l C a p t i o n > + 
+             < C o m p a n y H o m e P a g e > C o m p a n y   H o m e   P a g e < / C o m p a n y H o m e P a g e > + 
+             < C o m p a n y H o m e P a g e C a p t i o n > C o m p a n y   H o m e   P a g e   C a p t i o n < / C o m p a n y H o m e P a g e C a p t i o n > + 
+             < C o m p a n y L o g o > C o m p a n y   L o g o < / C o m p a n y L o g o > + 
+             < C o m p a n y V A T R e g i s t r a t i o n N o > C o m p a n y   V A T   R e g i s t r a t i o n   N o . < / C o m p a n y V A T R e g i s t r a t i o n N o > + 
+             < C o m p a n y V A T R e g i s t r a t i o n N o C a p t i o n > C o m p a n y   V A T   R e g i s t r a t i o n   N o .   C a p t i o n < / C o m p a n y V A T R e g i s t r a t i o n N o C a p t i o n > + 
+             < C o m p a n y R e g i s t r a t i o n N o > C o m p a n y   R e g i s t r a t i o n   N o . < / C o m p a n y R e g i s t r a t i o n N o > + 
+             < C o m p a n y R e g i s t r a t i o n N o C a p t i o n > C o m p a n y   R e g i s t r a t i o n   N o .   C a p t i o n < / C o m p a n y R e g i s t r a t i o n N o C a p t i o n > + 
+             < C o m p a n y B a n k N a m e > C o m p a n y   B a n k   N a m e < / C o m p a n y B a n k N a m e > + 
+             < C o m p a n y B a n k N a m e C a p t i o n > C o m p a n y   B a n k   N a m e   C a p t i o n < / C o m p a n y B a n k N a m e C a p t i o n > + 
+             < C o m p a n y B a n k A c c o u n t N o > C o m p a n y   B a n k   A c c o u n t   N o . < / C o m p a n y B a n k A c c o u n t N o > + 
+             < C o m p a n y B a n k A c c o u n t N o C a p t i o n > C o m p a n y   B a n k   A c c o u n t   N o .   C a p t i o n < / C o m p a n y B a n k A c c o u n t N o C a p t i o n > + 
+             < C o m p a n y B a n k B r a n c h N o > C o m p a n y   B a n k   B r a n c h   N o . < / C o m p a n y B a n k B r a n c h N o > + 
+             < C o m p a n y B a n k B r a n c h N o C a p t i o n > C o m p a n y   B a n k   B r a n c h   N o .   C a p t i o n < / C o m p a n y B a n k B r a n c h N o C a p t i o n > + 
+             < C o m p a n y I B A N > C o m p a n y   I B A N < / C o m p a n y I B A N > + 
+             < C o m p a n y I B A N C a p t i o n > C o m p a n y   I B A N   C a p t i o n < / C o m p a n y I B A N C a p t i o n > + 
+             < C o m p a n y B a n k S W I F T > C o m p a n y   B a n k   S W I F T < / C o m p a n y B a n k S W I F T > + 
+             < C o m p a n y B a n k S W I F T C a p t i o n > C o m p a n y   B a n k   S W I F T   C a p t i o n < / C o m p a n y B a n k S W I F T C a p t i o n > + 
+             < C o m p a n y G i r o N o > C o m p a n y   G i r o   N o . < / C o m p a n y G i r o N o > + 
+             < C o m p a n y G i r o N o C a p t i o n > C o m p a n y   G i r o   N o .   C a p t i o n < / C o m p a n y G i r o N o C a p t i o n > + 
+         < / C o m p a n y M e t a d a t a > + 
      < / B C R e p o r t I n f o r m a t i o n >   
      < L a b e l s > @@ -4397,14 +4647,30 @@
  
          < A s O f S t a r t D a t e T e x t > A s O f S t a r t D a t e T e x t < / A s O f S t a r t D a t e T e x t >   
+         < C o m p a n y N a m e > C o m p a n y N a m e < / C o m p a n y N a m e > + 
+         < C u r r R e p o r t P a g e N o C a p t i o n > C u r r R e p o r t P a g e N o C a p t i o n < / C u r r R e p o r t P a g e N o C a p t i o n > + 
          < D e s c _ P r o d u c t i o n O r d e r > D e s c _ P r o d u c t i o n O r d e r < / D e s c _ P r o d u c t i o n O r d e r >   
          < E n d D a t e > E n d D a t e < / E n d D a t e >   
+         < I n v e n t o r y V a l u a t i o n W I P C p t n > I n v e n t o r y V a l u a t i o n W I P C p t n < / I n v e n t o r y V a l u a t i o n W I P C p t n > + 
          < N o _ P r o d u c t i o n O r d e r > N o _ P r o d u c t i o n O r d e r < / N o _ P r o d u c t i o n O r d e r >   
+         < P r o d O r d e r D e s c r i p t i o n C a p t i o n > P r o d O r d e r D e s c r i p t i o n C a p t i o n < / P r o d O r d e r D e s c r i p t i o n C a p t i o n > + 
          < P r o d O r d e r F i l t e r > P r o d O r d e r F i l t e r < / P r o d O r d e r F i l t e r >   
+         < P r o d O r d e r S o u r c e N o C a p t i o n > P r o d O r d e r S o u r c e N o C a p t i o n < / P r o d O r d e r S o u r c e N o C a p t i o n > + 
+         < P r o d O r d e r S o u r c e T y p e C a p t n > P r o d O r d e r S o u r c e T y p e C a p t n < / P r o d O r d e r S o u r c e T y p e C a p t n > + 
+         < P r o d O r d e r S t a t u s C a p t i o n > P r o d O r d e r S t a t u s C a p t i o n < / P r o d O r d e r S t a t u s C a p t i o n > + 
+         < P r o d u c t i o n O r d e r N o C a p t i o n > P r o d u c t i o n O r d e r N o C a p t i o n < / P r o d u c t i o n O r d e r N o C a p t i o n > + 
          < S o u r c e N o _ P r o d u c t i o n O r d e r > S o u r c e N o _ P r o d u c t i o n O r d e r < / S o u r c e N o _ P r o d u c t i o n O r d e r >   
          < S r c T y p e _ P r o d u c t i o n O r d e r > S r c T y p e _ P r o d u c t i o n O r d e r < / S r c T y p e _ P r o d u c t i o n O r d e r > @@ -4413,10 +4679,24 @@
  
          < S t a t u s _ P r o d u c t i o n O r d e r > S t a t u s _ P r o d u c t i o n O r d e r < / S t a t u s _ P r o d u c t i o n O r d e r >   
+         < T o d a y F o r m a t t e d > T o d a y F o r m a t t e d < / T o d a y F o r m a t t e d > + 
+         < T o t a l C a p t i o n > T o t a l C a p t i o n < / T o t a l C a p t i o n > + 
+         < V a l u e E n t r y C o s t P o s t e d t o G L C a p t i o n > V a l u e E n t r y C o s t P o s t e d t o G L C a p t i o n < / V a l u e E n t r y C o s t P o s t e d t o G L C a p t i o n > + 
+         < V a l u e O f C a p C a p t i o n > V a l u e O f C a p C a p t i o n < / V a l u e O f C a p C a p t i o n > + 
+         < V a l u e O f M a t C o n s u m p C a p t i o n > V a l u e O f M a t C o n s u m p C a p t i o n < / V a l u e O f M a t C o n s u m p C a p t i o n > + 
+         < V a l u e O f O u t p u t C a p t i o n > V a l u e O f O u t p u t C a p t i o n < / V a l u e O f O u t p u t C a p t i o n > + 
          < V a l u e _ E n t r y >   
              < A t L a s t D a t e > A t L a s t D a t e < / A t L a s t D a t e >   
+             < E x p e n s e d W I P > E x p e n s e d W I P < / E x p e n s e d W I P > + 
              < L a s t O u t p u t > L a s t O u t p u t < / L a s t O u t p u t >   
              < L a s t W I P > L a s t W I P < / L a s t W I P > @@ -4439,6 +4719,8 @@
  
          < A t L a s t D a t e S u m > A t L a s t D a t e S u m < / A t L a s t D a t e S u m >   
+         < E x p e n s e d W I P S u m > E x p e n s e d W I P S u m < / E x p e n s e d W I P S u m > + 
          < L a t W i p S u m > L a t W i p S u m < / L a t W i p S u m >   
          < V a l u e E n t r y C o s t P o s t e d T o G L S u m > V a l u e E n t r y C o s t P o s t e d T o G L S u m < / V a l u e E n t r y C o s t P o s t e d T o G L S u m > @@ -4448,6 +4730,335 @@
          < V a l u e O f M a t C o n s u m p t i o n S u m > V a l u e O f M a t C o n s u m p t i o n S u m < / V a l u e O f M a t C o n s u m p t i o n S u m >   
          < V a l u e O f O u t p u t S u m > V a l u e O f O u t p u t S u m < / V a l u e O f O u t p u t S u m > + 
+     < / T o t a l s > + 
+ < / N a v W o r d R e p o r t X m l P a r t > 
+</file>
+
+<file path=customXml/item4.xml>��< ? x m l   v e r s i o n = " 1 . 0 "   e n c o d i n g = " u t f - 1 6 " ? > + 
+ < N a v W o r d R e p o r t X m l P a r t   x m l n s = " u r n : m i c r o s o f t - d y n a m i c s - b u s i n e s s c e n t r a l / i n t e r n a l / e x t e n d e d / r e p o r t s / I n v e n t o r y _ V a l u a t i o n _ W I P / 5 8 0 2 / " > + 
+     < B C R e p o r t I n f o r m a t i o n > + 
+         < R e p o r t M e t a d a t a > + 
+             < E x t e n s i o n I d > E x t e n s i o n   I D < / E x t e n s i o n I d > + 
+             < E x t e n s i o n N a m e > E x t e n s i o n   N a m e < / E x t e n s i o n N a m e > + 
+             < E x t e n s i o n P u b l i s h e r > E x t e n s i o n   P u b l i s h e r < / E x t e n s i o n P u b l i s h e r > + 
+             < E x t e n s i o n V e r s i o n > E x t e n s i o n   V e r s i o n < / E x t e n s i o n V e r s i o n > + 
+             < R e p o r t I d > R e p o r t   I D < / R e p o r t I d > + 
+             < R e p o r t N a m e > R e p o r t   N a m e < / R e p o r t N a m e > + 
+             < A b o u t T h i s R e p o r t T i t l e > A b o u t   T h i s   R e p o r t   T i t l e < / A b o u t T h i s R e p o r t T i t l e > + 
+             < A b o u t T h i s R e p o r t T e x t > A b o u t   T h i s   R e p o r t   T e x t < / A b o u t T h i s R e p o r t T e x t > + 
+             < R e p o r t H e l p L i n k > R e p o r t   H e l p   L i n k < / R e p o r t H e l p L i n k > + 
+         < / R e p o r t M e t a d a t a > + 
+         < R e p o r t R e q u e s t > + 
+             < T e n a n t E n t r a I d > T e n a n t   E n t r a   I d < / T e n a n t E n t r a I d > + 
+             < E n v i r o n m e n t N a m e > E n v i r o n m e n t   N a m e < / E n v i r o n m e n t N a m e > + 
+             < E n v i r o n m e n t T y p e > E n v i r o n m e n t   T y p e < / E n v i r o n m e n t T y p e > + 
+             < C o m p a n y N a m e > C o m p a n y   N a m e < / C o m p a n y N a m e > + 
+             < C o m p a n y D i s p l a y N a m e > C o m p a n y   D i s p l a y   N a m e < / C o m p a n y D i s p l a y N a m e > + 
+             < C o m p a n y I d > C o m p a n y   I D < / C o m p a n y I d > + 
+             < U s e r N a m e > U s e r   N a m e < / U s e r N a m e > + 
+             < D a t e A n d T i m e > D a t e   a n d   T i m e < / D a t e A n d T i m e > + 
+             < L a n g u a g e > L a n g u a g e < / L a n g u a g e > + 
+             < F o r m a t R e g i o n > F o r m a t   R e g i o n < / F o r m a t R e g i o n > + 
+             < D a t e T i m e V a l u e s > + 
+                 < Y e a r > Y e a r < / Y e a r > + 
+                 < M o n t h N u m b e r > M o n t h   N u m b e r < / M o n t h N u m b e r > + 
+                 < D a y N u m b e r > D a y   N u m b e r < / D a y N u m b e r > + 
+                 < H o u r > H o u r < / H o u r > + 
+                 < M i n u t e > M i n u t e < / M i n u t e > + 
+             < / D a t e T i m e V a l u e s > + 
+         < / R e p o r t R e q u e s t > + 
+         < C o m p a n y M e t a d a t a > + 
+             < C o m p a n y N a m e > C o m p a n y   N a m e < / C o m p a n y N a m e > + 
+             < C o m p a n y D i s p l a y N a m e > C o m p a n y   D i s p l a y   N a m e < / C o m p a n y D i s p l a y N a m e > + 
+             < C o m p a n y A d d r e s s L i n e s > + 
+                 < C o m p a n y A d d r e s s L i n e > C o m p a n y   A d d r e s s   L i n e   1 < / C o m p a n y A d d r e s s L i n e > + 
+                 < C o m p a n y A d d r e s s L i n e > C o m p a n y   A d d r e s s   L i n e   2 < / C o m p a n y A d d r e s s L i n e > + 
+                 < C o m p a n y A d d r e s s L i n e > C o m p a n y   A d d r e s s   L i n e   3 < / C o m p a n y A d d r e s s L i n e > + 
+                 < C o m p a n y A d d r e s s L i n e > C o m p a n y   A d d r e s s   L i n e   4 < / C o m p a n y A d d r e s s L i n e > + 
+                 < C o m p a n y A d d r e s s L i n e > C o m p a n y   A d d r e s s   L i n e   5 < / C o m p a n y A d d r e s s L i n e > + 
+                 < C o m p a n y A d d r e s s L i n e > C o m p a n y   A d d r e s s   L i n e   6 < / C o m p a n y A d d r e s s L i n e > + 
+                 < C o m p a n y A d d r e s s L i n e > C o m p a n y   A d d r e s s   L i n e   7 < / C o m p a n y A d d r e s s L i n e > + 
+                 < C o m p a n y A d d r e s s L i n e > C o m p a n y   A d d r e s s   L i n e   8 < / C o m p a n y A d d r e s s L i n e > + 
+             < / C o m p a n y A d d r e s s L i n e s > + 
+             < C o m p a n y P h o n e > C o m p a n y   P h o n e < / C o m p a n y P h o n e > + 
+             < C o m p a n y P h o n e C a p t i o n > C o m p a n y   P h o n e   C a p t i o n < / C o m p a n y P h o n e C a p t i o n > + 
+             < C o m p a n y F a x N o > C o m p a n y   F a x   N o . < / C o m p a n y F a x N o > + 
+             < C o m p a n y F a x N o C a p t i o n > C o m p a n y   F a x   N o .   C a p t i o n < / C o m p a n y F a x N o C a p t i o n > + 
+             < C o m p a n y E m a i l > C o m p a n y   E m a i l < / C o m p a n y E m a i l > + 
+             < C o m p a n y E m a i l C a p t i o n > C o m p a n y   E m a i l   C a p t i o n < / C o m p a n y E m a i l C a p t i o n > + 
+             < C o m p a n y H o m e P a g e > C o m p a n y   H o m e   P a g e < / C o m p a n y H o m e P a g e > + 
+             < C o m p a n y H o m e P a g e C a p t i o n > C o m p a n y   H o m e   P a g e   C a p t i o n < / C o m p a n y H o m e P a g e C a p t i o n > + 
+             < C o m p a n y L o g o > C o m p a n y   L o g o < / C o m p a n y L o g o > + 
+             < C o m p a n y V A T R e g i s t r a t i o n N o > C o m p a n y   V A T   R e g i s t r a t i o n   N o . < / C o m p a n y V A T R e g i s t r a t i o n N o > + 
+             < C o m p a n y V A T R e g i s t r a t i o n N o C a p t i o n > C o m p a n y   V A T   R e g i s t r a t i o n   N o .   C a p t i o n < / C o m p a n y V A T R e g i s t r a t i o n N o C a p t i o n > + 
+             < C o m p a n y R e g i s t r a t i o n N o > C o m p a n y   R e g i s t r a t i o n   N o . < / C o m p a n y R e g i s t r a t i o n N o > + 
+             < C o m p a n y R e g i s t r a t i o n N o C a p t i o n > C o m p a n y   R e g i s t r a t i o n   N o .   C a p t i o n < / C o m p a n y R e g i s t r a t i o n N o C a p t i o n > + 
+             < C o m p a n y B a n k N a m e > C o m p a n y   B a n k   N a m e < / C o m p a n y B a n k N a m e > + 
+             < C o m p a n y B a n k N a m e C a p t i o n > C o m p a n y   B a n k   N a m e   C a p t i o n < / C o m p a n y B a n k N a m e C a p t i o n > + 
+             < C o m p a n y B a n k A c c o u n t N o > C o m p a n y   B a n k   A c c o u n t   N o . < / C o m p a n y B a n k A c c o u n t N o > + 
+             < C o m p a n y B a n k A c c o u n t N o C a p t i o n > C o m p a n y   B a n k   A c c o u n t   N o .   C a p t i o n < / C o m p a n y B a n k A c c o u n t N o C a p t i o n > + 
+             < C o m p a n y B a n k B r a n c h N o > C o m p a n y   B a n k   B r a n c h   N o . < / C o m p a n y B a n k B r a n c h N o > + 
+             < C o m p a n y B a n k B r a n c h N o C a p t i o n > C o m p a n y   B a n k   B r a n c h   N o .   C a p t i o n < / C o m p a n y B a n k B r a n c h N o C a p t i o n > + 
+             < C o m p a n y I B A N > C o m p a n y   I B A N < / C o m p a n y I B A N > + 
+             < C o m p a n y I B A N C a p t i o n > C o m p a n y   I B A N   C a p t i o n < / C o m p a n y I B A N C a p t i o n > + 
+             < C o m p a n y B a n k S W I F T > C o m p a n y   B a n k   S W I F T < / C o m p a n y B a n k S W I F T > + 
+             < C o m p a n y B a n k S W I F T C a p t i o n > C o m p a n y   B a n k   S W I F T   C a p t i o n < / C o m p a n y B a n k S W I F T C a p t i o n > + 
+             < C o m p a n y G i r o N o > C o m p a n y   G i r o   N o . < / C o m p a n y G i r o N o > + 
+             < C o m p a n y G i r o N o C a p t i o n > C o m p a n y   G i r o   N o .   C a p t i o n < / C o m p a n y G i r o N o C a p t i o n > + 
+         < / C o m p a n y M e t a d a t a > + 
+     < / B C R e p o r t I n f o r m a t i o n > + 
+     < L a b e l s > + 
+         < A b o u t T h e R e p o r t L b l   E l e m e n t T y p e = " P a r a m e t e r "   E l e m e n t I d = " 2 0 0 7 3 2 1 8 4 5 "   D a t a T y p e = " S t r i n g " > A b o u t T h e R e p o r t L b l < / A b o u t T h e R e p o r t L b l > + 
+         < A s O f E n d D a t e L b l   E l e m e n t T y p e = " P a r a m e t e r "   E l e m e n t I d = " 1 0 4 5 2 4 1 3 9 3 "   D a t a T y p e = " S t r i n g " > A s O f E n d D a t e L b l < / A s O f E n d D a t e L b l > + 
+         < A s O f S t a r t D a t e L b l   E l e m e n t T y p e = " P a r a m e t e r "   E l e m e n t I d = " 9 3 4 3 4 5 8 4 0 "   D a t a T y p e = " S t r i n g " > A s O f S t a r t D a t e L b l < / A s O f S t a r t D a t e L b l > + 
+         < C a p a c i t y L b l   E l e m e n t T y p e = " P a r a m e t e r "   E l e m e n t I d = " 2 0 7 6 7 3 8 6 0 3 "   D a t a T y p e = " S t r i n g " > C a p a c i t y L b l < / C a p a c i t y L b l > + 
+         < C o m p a n y L b l   E l e m e n t T y p e = " P a r a m e t e r "   E l e m e n t I d = " 7 6 3 5 6 2 8 8 8 "   D a t a T y p e = " S t r i n g " > C o m p a n y L b l < / C o m p a n y L b l > + 
+         < C o n s u m p t i o n L b l   E l e m e n t T y p e = " P a r a m e t e r "   E l e m e n t I d = " 9 2 6 2 6 2 5 9 4 "   D a t a T y p e = " S t r i n g " > C o n s u m p t i o n L b l < / C o n s u m p t i o n L b l > + 
+         < C o s t P o s t e d T o G L L b l   E l e m e n t T y p e = " P a r a m e t e r "   E l e m e n t I d = " 1 6 0 2 2 9 5 8 2 9 "   D a t a T y p e = " S t r i n g " > C o s t P o s t e d T o G L L b l < / C o s t P o s t e d T o G L L b l > + 
+         < D a t a R e t r i e v e d L b l   E l e m e n t T y p e = " P a r a m e t e r "   E l e m e n t I d = " 1 0 9 1 6 8 3 3 6 5 "   D a t a T y p e = " S t r i n g " > D a t a R e t r i e v e d L b l < / D a t a R e t r i e v e d L b l > + 
+         < D e s c _ P r o d u c t i o n O r d e r C a p t i o n   E l e m e n t T y p e = " P a r a m e t e r "   E l e m e n t I d = " 1 4 1 2 5 5 5 1 6 2 "   D a t a T y p e = " S t r i n g " > D e s c _ P r o d u c t i o n O r d e r C a p t i o n < / D e s c _ P r o d u c t i o n O r d e r C a p t i o n > + 
+         < D o c u m e n t a t i o n L b l   E l e m e n t T y p e = " P a r a m e t e r "   E l e m e n t I d = " 1 0 5 1 7 2 3 1 7 3 "   D a t a T y p e = " S t r i n g " > D o c u m e n t a t i o n L b l < / D o c u m e n t a t i o n L b l > + 
+         < E n v i r o n m e n t L b l   E l e m e n t T y p e = " P a r a m e t e r "   E l e m e n t I d = " 2 0 1 5 9 0 6 0 7 0 "   D a t a T y p e = " S t r i n g " > E n v i r o n m e n t L b l < / E n v i r o n m e n t L b l > + 
+         < N o _ P r o d u c t i o n O r d e r C a p t i o n   E l e m e n t T y p e = " P a r a m e t e r "   E l e m e n t I d = " 5 5 2 8 8 8 6 2 "   D a t a T y p e = " S t r i n g " > N o _ P r o d u c t i o n O r d e r C a p t i o n < / N o _ P r o d u c t i o n O r d e r C a p t i o n > + 
+         < O u t p u t L b l   E l e m e n t T y p e = " P a r a m e t e r "   E l e m e n t I d = " 9 2 9 0 1 9 5 8 4 "   D a t a T y p e = " S t r i n g " > O u t p u t L b l < / O u t p u t L b l > + 
+         < P e r i o d L b l   E l e m e n t T y p e = " P a r a m e t e r "   E l e m e n t I d = " 1 2 5 2 9 1 7 0 8 6 "   D a t a T y p e = " S t r i n g " > P e r i o d L b l < / P e r i o d L b l > + 
+         < P r o d O r d e r W i p A n a l y s i s L b l   E l e m e n t T y p e = " P a r a m e t e r "   E l e m e n t I d = " 1 9 6 4 6 7 9 3 3 2 "   D a t a T y p e = " S t r i n g " > P r o d O r d e r W i p A n a l y s i s L b l < / P r o d O r d e r W i p A n a l y s i s L b l > + 
+         < P r o d O r d e r W I P L b l   E l e m e n t T y p e = " P a r a m e t e r "   E l e m e n t I d = " 4 9 2 8 5 7 9 3 8 "   D a t a T y p e = " S t r i n g " > P r o d O r d e r W I P L b l < / P r o d O r d e r W I P L b l > + 
+         < P r o d O r d e r W i p P r i n t L b l   E l e m e n t T y p e = " P a r a m e t e r "   E l e m e n t I d = " 1 0 0 3 2 0 4 7 3 5 "   D a t a T y p e = " S t r i n g " > P r o d O r d e r W i p P r i n t L b l < / P r o d O r d e r W i p P r i n t L b l > + 
+         < R e p o r t N a m e L b l   E l e m e n t T y p e = " P a r a m e t e r "   E l e m e n t I d = " 1 5 2 9 7 0 2 3 5 4 "   D a t a T y p e = " S t r i n g " > R e p o r t N a m e L b l < / R e p o r t N a m e L b l > + 
+         < R u n O n L b l   E l e m e n t T y p e = " P a r a m e t e r "   E l e m e n t I d = " 1 6 8 8 7 9 5 3 1 3 "   D a t a T y p e = " S t r i n g " > R u n O n L b l < / R u n O n L b l > + 
+         < S o u r c e N o _ P r o d u c t i o n O r d e r C a p t i o n   E l e m e n t T y p e = " P a r a m e t e r "   E l e m e n t I d = " 1 2 9 4 4 8 1 2 7 7 "   D a t a T y p e = " S t r i n g " > S o u r c e N o _ P r o d u c t i o n O r d e r C a p t i o n < / S o u r c e N o _ P r o d u c t i o n O r d e r C a p t i o n > + 
+         < S r c T y p e _ P r o d u c t i o n O r d e r C a p t i o n   E l e m e n t T y p e = " P a r a m e t e r "   E l e m e n t I d = " 1 6 9 1 4 6 0 0 7 5 "   D a t a T y p e = " S t r i n g " > S r c T y p e _ P r o d u c t i o n O r d e r C a p t i o n < / S r c T y p e _ P r o d u c t i o n O r d e r C a p t i o n > + 
+         < S t a t u s _ P r o d u c t i o n O r d e r C a p t i o n   E l e m e n t T y p e = " P a r a m e t e r "   E l e m e n t I d = " 4 4 7 6 3 5 3 2 3 "   D a t a T y p e = " S t r i n g " > S t a t u s _ P r o d u c t i o n O r d e r C a p t i o n < / S t a t u s _ P r o d u c t i o n O r d e r C a p t i o n > + 
+         < T o t a l L b l   E l e m e n t T y p e = " P a r a m e t e r "   E l e m e n t I d = " 2 6 2 6 5 4 8 3 7 "   D a t a T y p e = " S t r i n g " > T o t a l L b l < / T o t a l L b l > + 
+         < U n t i l L b l   E l e m e n t T y p e = " P a r a m e t e r "   E l e m e n t I d = " 1 0 3 4 4 0 9 9 6 3 "   D a t a T y p e = " S t r i n g " > U n t i l L b l < / U n t i l L b l > + 
+         < U s e r L b l   E l e m e n t T y p e = " P a r a m e t e r "   E l e m e n t I d = " 1 4 8 0 8 1 6 0 6 2 "   D a t a T y p e = " S t r i n g " > U s e r L b l < / U s e r L b l > + 
+     < / L a b e l s > + 
+     < T o o l t i p s > + 
+         < T o o l t i p   c o l u m n = " N o _ P r o d u c t i o n O r d e r "   E l e m e n t I d = " 5 5 2 8 8 8 6 2 " > + 
+             < T o o l t i p T e x t   l a n g = " e n - U S " > S p e c i f i e s   t h e   n u m b e r   o f   t h e   i n v o l v e d   e n t r y   o r   r e c o r d ,   a c c o r d i n g   t o   t h e   s p e c i f i e d   n u m b e r   s e r i e s . < / T o o l t i p T e x t > + 
+         < / T o o l t i p > + 
+         < T o o l t i p   c o l u m n = " S o u r c e N o _ P r o d u c t i o n O r d e r "   E l e m e n t I d = " 1 2 9 4 4 8 1 2 7 7 " > + 
+             < T o o l t i p T e x t   l a n g = " e n - U S " > S p e c i f i e s   t h e   n u m b e r   o f   t h e   s o u r c e   d o c u m e n t   t h a t   t h e   e n t r y   o r i g i n a t e s   f r o m . < / T o o l t i p T e x t > + 
+         < / T o o l t i p > + 
+         < T o o l t i p   c o l u m n = " S r c T y p e _ P r o d u c t i o n O r d e r "   E l e m e n t I d = " 1 6 9 1 4 6 0 0 7 5 " > + 
+             < T o o l t i p T e x t   l a n g = " e n - U S " > S p e c i f i e s   t h e   s o u r c e   t y p e   o f   t h e   p r o d u c t i o n   o r d e r . < / T o o l t i p T e x t > + 
+         < / T o o l t i p > + 
+         < T o o l t i p   c o l u m n = " D e s c _ P r o d u c t i o n O r d e r "   E l e m e n t I d = " 1 4 1 2 5 5 5 1 6 2 " > + 
+             < T o o l t i p T e x t   l a n g = " e n - U S " > S p e c i f i e s   t h e   d e s c r i p t i o n   o f   t h e   p r o d u c t i o n   o r d e r . < / T o o l t i p T e x t > + 
+         < / T o o l t i p > + 
+         < T o o l t i p   c o l u m n = " S t a t u s _ P r o d u c t i o n O r d e r "   E l e m e n t I d = " 4 4 7 6 3 5 3 2 3 " > + 
+             < T o o l t i p T e x t   l a n g = " e n - U S " > S p e c i f i e s   t h e   s t a t u s   o f   t h e   p r o d u c t i o n   o r d e r . < / T o o l t i p T e x t > + 
+         < / T o o l t i p > + 
+     < / T o o l t i p s > + 
+     < P r o d u c t i o n _ O r d e r   E l e m e n t T y p e = " D a t a I t e m "   E l e m e n t I d = " 1 9 8 2 1 1 8 5 " > + 
+         < A s o f E n d D a t e   E l e m e n t T y p e = " C o l u m n "   E l e m e n t I d = " 3 3 3 0 8 5 3 0 1 "   D a t a T y p e = " S t r i n g " > A s o f E n d D a t e < / A s o f E n d D a t e > + 
+         < A s O f S t a r t D a t e T e x t   E l e m e n t T y p e = " C o l u m n "   E l e m e n t I d = " 5 0 4 9 4 0 5 6 9 "   D a t a T y p e = " S t r i n g " > A s O f S t a r t D a t e T e x t < / A s O f S t a r t D a t e T e x t > + 
+         < C o m p a n y N a m e   E l e m e n t T y p e = " C o l u m n "   E l e m e n t I d = " 1 5 9 5 4 7 7 3 9 5 "   D a t a T y p e = " S t r i n g "   O b s o l e t e S t a t e = " P e n d i n g " > C o m p a n y N a m e < / C o m p a n y N a m e > + 
+         < C u r r R e p o r t P a g e N o C a p t i o n   E l e m e n t T y p e = " C o l u m n "   E l e m e n t I d = " 2 0 2 2 2 2 5 3 5 1 "   D a t a T y p e = " L a b e l "   O b s o l e t e S t a t e = " P e n d i n g " > C u r r R e p o r t P a g e N o C a p t i o n < / C u r r R e p o r t P a g e N o C a p t i o n > + 
+         < D e s c _ P r o d u c t i o n O r d e r   E l e m e n t T y p e = " C o l u m n "   E l e m e n t I d = " 1 4 1 2 5 5 5 1 6 2 "   D a t a T y p e = " T e x t " > D e s c _ P r o d u c t i o n O r d e r < / D e s c _ P r o d u c t i o n O r d e r > + 
+         < E n d D a t e   E l e m e n t T y p e = " C o l u m n "   E l e m e n t I d = " 1 3 0 2 0 8 2 6 1 0 "   D a t a T y p e = " D a t e " > E n d D a t e < / E n d D a t e > + 
+         < I n v e n t o r y V a l u a t i o n W I P C p t n   E l e m e n t T y p e = " C o l u m n "   E l e m e n t I d = " 9 8 3 3 4 8 2 1 3 "   D a t a T y p e = " L a b e l "   O b s o l e t e S t a t e = " P e n d i n g " > I n v e n t o r y V a l u a t i o n W I P C p t n < / I n v e n t o r y V a l u a t i o n W I P C p t n > + 
+         < N o _ P r o d u c t i o n O r d e r   E l e m e n t T y p e = " C o l u m n "   E l e m e n t I d = " 5 5 2 8 8 8 6 2 "   D a t a T y p e = " C o d e " > N o _ P r o d u c t i o n O r d e r < / N o _ P r o d u c t i o n O r d e r > + 
+         < P r o d O r d e r D e s c r i p t i o n C a p t i o n   E l e m e n t T y p e = " C o l u m n "   E l e m e n t I d = " 6 4 4 4 3 2 0 4 6 "   D a t a T y p e = " L a b e l "   O b s o l e t e S t a t e = " P e n d i n g " > P r o d O r d e r D e s c r i p t i o n C a p t i o n < / P r o d O r d e r D e s c r i p t i o n C a p t i o n > + 
+         < P r o d O r d e r F i l t e r   E l e m e n t T y p e = " C o l u m n "   E l e m e n t I d = " 7 4 5 9 1 5 0 5 4 "   D a t a T y p e = " T e x t " > P r o d O r d e r F i l t e r < / P r o d O r d e r F i l t e r > + 
+         < P r o d O r d e r S o u r c e N o C a p t i o n   E l e m e n t T y p e = " C o l u m n "   E l e m e n t I d = " 9 0 4 9 9 1 2 6 4 "   D a t a T y p e = " L a b e l "   O b s o l e t e S t a t e = " P e n d i n g " > P r o d O r d e r S o u r c e N o C a p t i o n < / P r o d O r d e r S o u r c e N o C a p t i o n > + 
+         < P r o d O r d e r S o u r c e T y p e C a p t n   E l e m e n t T y p e = " C o l u m n "   E l e m e n t I d = " 2 1 5 7 3 7 2 2 3 "   D a t a T y p e = " L a b e l "   O b s o l e t e S t a t e = " P e n d i n g " > P r o d O r d e r S o u r c e T y p e C a p t n < / P r o d O r d e r S o u r c e T y p e C a p t n > + 
+         < P r o d O r d e r S t a t u s C a p t i o n   E l e m e n t T y p e = " C o l u m n "   E l e m e n t I d = " 2 8 5 3 4 5 7 8 4 "   D a t a T y p e = " L a b e l "   O b s o l e t e S t a t e = " P e n d i n g " > P r o d O r d e r S t a t u s C a p t i o n < / P r o d O r d e r S t a t u s C a p t i o n > + 
+         < P r o d u c t i o n O r d e r N o C a p t i o n   E l e m e n t T y p e = " C o l u m n "   E l e m e n t I d = " 1 2 0 0 5 2 3 0 2 3 "   D a t a T y p e = " L a b e l "   O b s o l e t e S t a t e = " P e n d i n g " > P r o d u c t i o n O r d e r N o C a p t i o n < / P r o d u c t i o n O r d e r N o C a p t i o n > + 
+         < S o u r c e N o _ P r o d u c t i o n O r d e r   E l e m e n t T y p e = " C o l u m n "   E l e m e n t I d = " 1 2 9 4 4 8 1 2 7 7 "   D a t a T y p e = " C o d e " > S o u r c e N o _ P r o d u c t i o n O r d e r < / S o u r c e N o _ P r o d u c t i o n O r d e r > + 
+         < S r c T y p e _ P r o d u c t i o n O r d e r   E l e m e n t T y p e = " C o l u m n "   E l e m e n t I d = " 1 6 9 1 4 6 0 0 7 5 "   D a t a T y p e = " E n u m " > S r c T y p e _ P r o d u c t i o n O r d e r < / S r c T y p e _ P r o d u c t i o n O r d e r > + 
+         < S t a r t D a t e   E l e m e n t T y p e = " C o l u m n "   E l e m e n t I d = " 1 4 5 7 6 6 9 4 1 7 "   D a t a T y p e = " T e x t " > S t a r t D a t e < / S t a r t D a t e > + 
+         < S t a t u s _ P r o d u c t i o n O r d e r   E l e m e n t T y p e = " C o l u m n "   E l e m e n t I d = " 4 4 7 6 3 5 3 2 3 "   D a t a T y p e = " E n u m " > S t a t u s _ P r o d u c t i o n O r d e r < / S t a t u s _ P r o d u c t i o n O r d e r > + 
+         < T o d a y F o r m a t t e d   E l e m e n t T y p e = " C o l u m n "   E l e m e n t I d = " 2 7 0 4 5 1 4 0 "   D a t a T y p e = " S t r i n g "   O b s o l e t e S t a t e = " P e n d i n g " > T o d a y F o r m a t t e d < / T o d a y F o r m a t t e d > + 
+         < T o t a l C a p t i o n   E l e m e n t T y p e = " C o l u m n "   E l e m e n t I d = " 7 0 7 1 0 2 6 9 5 "   D a t a T y p e = " L a b e l "   O b s o l e t e S t a t e = " P e n d i n g " > T o t a l C a p t i o n < / T o t a l C a p t i o n > + 
+         < V a l u e E n t r y C o s t P o s t e d t o G L C a p t i o n   E l e m e n t T y p e = " C o l u m n "   E l e m e n t I d = " 8 4 8 6 5 5 3 5 8 "   D a t a T y p e = " L a b e l "   O b s o l e t e S t a t e = " P e n d i n g " > V a l u e E n t r y C o s t P o s t e d t o G L C a p t i o n < / V a l u e E n t r y C o s t P o s t e d t o G L C a p t i o n > + 
+         < V a l u e O f C a p C a p t i o n   E l e m e n t T y p e = " C o l u m n "   E l e m e n t I d = " 1 7 5 8 9 5 8 5 5 7 "   D a t a T y p e = " L a b e l "   O b s o l e t e S t a t e = " P e n d i n g " > V a l u e O f C a p C a p t i o n < / V a l u e O f C a p C a p t i o n > + 
+         < V a l u e O f M a t C o n s u m p C a p t i o n   E l e m e n t T y p e = " C o l u m n "   E l e m e n t I d = " 1 9 4 6 0 1 5 2 0 0 "   D a t a T y p e = " L a b e l "   O b s o l e t e S t a t e = " P e n d i n g " > V a l u e O f M a t C o n s u m p C a p t i o n < / V a l u e O f M a t C o n s u m p C a p t i o n > + 
+         < V a l u e O f O u t p u t C a p t i o n   E l e m e n t T y p e = " C o l u m n "   E l e m e n t I d = " 8 0 2 8 2 3 8 8 6 "   D a t a T y p e = " L a b e l "   O b s o l e t e S t a t e = " P e n d i n g " > V a l u e O f O u t p u t C a p t i o n < / V a l u e O f O u t p u t C a p t i o n > + 
+         < V a l u e _ E n t r y   E l e m e n t T y p e = " D a t a I t e m "   E l e m e n t I d = " 1 4 7 2 6 5 1 0 7 7 " > + 
+             < A t L a s t D a t e   E l e m e n t T y p e = " C o l u m n "   E l e m e n t I d = " 1 9 2 2 3 1 9 8 4 6 "   D a t a T y p e = " D e c i m a l " > A t L a s t D a t e < / A t L a s t D a t e > + 
+             < E x p e n s e d W I P   E l e m e n t T y p e = " C o l u m n "   E l e m e n t I d = " 1 8 7 9 1 1 8 4 1 "   D a t a T y p e = " D e c i m a l " > E x p e n s e d W I P < / E x p e n s e d W I P > + 
+             < L a s t O u t p u t   E l e m e n t T y p e = " C o l u m n "   E l e m e n t I d = " 2 1 7 4 6 8 1 1 2 "   D a t a T y p e = " D e c i m a l " > L a s t O u t p u t < / L a s t O u t p u t > + 
+             < L a s t W I P   E l e m e n t T y p e = " C o l u m n "   E l e m e n t I d = " 4 2 1 6 5 4 3 3 "   D a t a T y p e = " D e c i m a l " > L a s t W I P < / L a s t W I P > + 
+             < V a l u e E n t r y C o s t P o s t e d t o G L   E l e m e n t T y p e = " C o l u m n "   E l e m e n t I d = " 1 7 8 8 6 7 1 8 5 6 "   D a t a T y p e = " D e c i m a l " > V a l u e E n t r y C o s t P o s t e d t o G L < / V a l u e E n t r y C o s t P o s t e d t o G L > + 
+             < V a l u e O f C a p   E l e m e n t T y p e = " C o l u m n "   E l e m e n t I d = " 1 1 4 6 9 0 9 5 5 7 "   D a t a T y p e = " D e c i m a l " > V a l u e O f C a p < / V a l u e O f C a p > + 
+             < V a l u e O f M a t C o n s u m p   E l e m e n t T y p e = " C o l u m n "   E l e m e n t I d = " 1 1 0 4 3 0 8 3 5 0 "   D a t a T y p e = " D e c i m a l " > V a l u e O f M a t C o n s u m p < / V a l u e O f M a t C o n s u m p > + 
+             < V a l u e O f O u t p u t   E l e m e n t T y p e = " C o l u m n "   E l e m e n t I d = " 9 8 0 0 5 5 0 0 8 "   D a t a T y p e = " D e c i m a l " > V a l u e O f O u t p u t < / V a l u e O f O u t p u t > + 
+             < V a l u e O f W I P   E l e m e n t T y p e = " C o l u m n "   E l e m e n t I d = " 1 4 1 3 4 5 6 2 6 5 "   D a t a T y p e = " D e c i m a l " > V a l u e O f W I P < / V a l u e O f W I P > + 
+         < / V a l u e _ E n t r y > + 
+     < / P r o d u c t i o n _ O r d e r > + 
+     < T o t a l s   E l e m e n t T y p e = " D a t a I t e m "   E l e m e n t I d = " 1 8 2 3 9 5 0 0 4 4 " > + 
+         < A t L a s t D a t e S u m   E l e m e n t T y p e = " C o l u m n "   E l e m e n t I d = " 3 2 5 0 3 3 4 5 3 "   D a t a T y p e = " D e c i m a l " > A t L a s t D a t e S u m < / A t L a s t D a t e S u m > + 
+         < E x p e n s e d W I P S u m   E l e m e n t T y p e = " C o l u m n "   E l e m e n t I d = " 3 7 5 0 1 6 3 3 2 "   D a t a T y p e = " D e c i m a l " > E x p e n s e d W I P S u m < / E x p e n s e d W I P S u m > + 
+         < L a t W i p S u m   E l e m e n t T y p e = " C o l u m n "   E l e m e n t I d = " 1 1 1 3 9 9 6 1 "   D a t a T y p e = " D e c i m a l " > L a t W i p S u m < / L a t W i p S u m > + 
+         < V a l u e E n t r y C o s t P o s t e d T o G L S u m   E l e m e n t T y p e = " C o l u m n "   E l e m e n t I d = " 2 0 5 9 9 6 0 5 5 5 "   D a t a T y p e = " D e c i m a l " > V a l u e E n t r y C o s t P o s t e d T o G L S u m < / V a l u e E n t r y C o s t P o s t e d T o G L S u m > + 
+         < V a l u e O f C a p S u m   E l e m e n t T y p e = " C o l u m n "   E l e m e n t I d = " 1 8 7 4 2 3 3 8 6 "   D a t a T y p e = " D e c i m a l " > V a l u e O f C a p S u m < / V a l u e O f C a p S u m > + 
+         < V a l u e O f M a t C o n s u m p t i o n S u m   E l e m e n t T y p e = " C o l u m n "   E l e m e n t I d = " 3 9 6 0 7 5 6 6 3 "   D a t a T y p e = " D e c i m a l " > V a l u e O f M a t C o n s u m p t i o n S u m < / V a l u e O f M a t C o n s u m p t i o n S u m > + 
+         < V a l u e O f O u t p u t S u m   E l e m e n t T y p e = " C o l u m n "   E l e m e n t I d = " 4 2 2 9 1 8 6 2 9 "   D a t a T y p e = " D e c i m a l " > V a l u e O f O u t p u t S u m < / V a l u e O f O u t p u t S u m >   
      < / T o t a l s >   
@@ -4462,14 +5073,6 @@
 </ds:datastoreItem>
 </file>
 
-<file path=customXml/itemProps2.xml><?xml version="1.0" encoding="utf-8"?>
-<ds:datastoreItem xmlns:ds="http://schemas.openxmlformats.org/officeDocument/2006/customXml" ds:itemID="{3F37AC5C-CB25-4576-B933-8E34232D5829}">
-  <ds:schemaRefs>
-    <ds:schemaRef ds:uri="urn:microsoft-dynamics-nav/reports/FS_YSD_InventoryValuationWIP/50008/"/>
-  </ds:schemaRefs>
-</ds:datastoreItem>
-</file>
-
 <file path=docMetadata/LabelInfo.xml><?xml version="1.0" encoding="utf-8"?>
 <clbl:labelList xmlns:clbl="http://schemas.microsoft.com/office/2020/mipLabelMetadata">
   <clbl:label id="{85ca8af4-763a-45c2-80ae-a5ca1b80bddc}" enabled="1" method="Standard" siteId="{06cdaf09-14f0-4cd1-8ac0-7bfed707a82c}" contentBits="0" removed="0"/>

</xml_diff>

<commit_message>
Refactor WIP Report logic to handlewrite-off in the selected period
</commit_message>
<xml_diff>
--- a/src/Layers/W1/BaseApp/Manufacturing/Reports/InventoryValuationWIP.docx
+++ b/src/Layers/W1/BaseApp/Manufacturing/Reports/InventoryValuationWIP.docx
@@ -624,37 +624,58 @@
             </w:tc>
           </w:sdtContent>
         </w:sdt>
-        <w:tc>
-          <w:tcPr>
-            <w:tcW w:w="1276" w:type="dxa"/>
-            <w:tcBorders>
-              <w:bottom w:val="single" w:color="auto" w:sz="4" w:space="0"/>
-            </w:tcBorders>
-            <w:vAlign w:val="bottom"/>
-          </w:tcPr>
-          <w:p>
-            <w:pPr>
-              <w:jc w:val="right"/>
-              <w:rPr>
-                <w:rFonts w:ascii="Segoe UI" w:hAnsi="Segoe UI" w:cs="Segoe UI"/>
-                <w:b/>
-                <w:bCs/>
-                <w:sz w:val="16"/>
-                <w:szCs w:val="16"/>
-              </w:rPr>
-            </w:pPr>
-            <w:r>
-              <w:rPr>
-                <w:rFonts w:ascii="Segoe UI" w:hAnsi="Segoe UI" w:cs="Segoe UI"/>
-                <w:b/>
-                <w:bCs/>
-                <w:sz w:val="16"/>
-                <w:szCs w:val="16"/>
-              </w:rPr>
-              <w:t>Expensed WIP</w:t>
-            </w:r>
-          </w:p>
-        </w:tc>
+        <w:sdt>
+          <w:sdtPr>
+            <w:rPr>
+              <w:rFonts w:ascii="Segoe UI" w:hAnsi="Segoe UI" w:cs="Segoe UI"/>
+              <w:b/>
+              <w:bCs/>
+              <w:sz w:val="16"/>
+              <w:szCs w:val="16"/>
+            </w:rPr>
+            <w:alias w:val="#Nav: /Labels/ExpensedWIPLbl"/>
+            <w:tag w:val="#Nav: Inventory_Valuation_WIP/5802"/>
+            <w:id w:val="904318601"/>
+            <w:placeholder>
+              <w:docPart w:val="DefaultPlaceholder_-1854013440"/>
+            </w:placeholder>
+            <w:dataBinding w:prefixMappings="xmlns:ns0='urn:microsoft-dynamics-nav/reports/Inventory_Valuation_WIP/5802/'" w:xpath="/ns0:NavWordReportXmlPart[1]/ns0:Labels[1]/ns0:ExpensedWIPLbl[1]" w:storeItemID="{3F37AC5C-CB25-4576-B933-8E34232D5829}"/>
+            <w:text/>
+          </w:sdtPr>
+          <w:sdtContent>
+            <w:tc>
+              <w:tcPr>
+                <w:tcW w:w="1276" w:type="dxa"/>
+                <w:tcBorders>
+                  <w:bottom w:val="single" w:color="auto" w:sz="4" w:space="0"/>
+                </w:tcBorders>
+                <w:vAlign w:val="bottom"/>
+              </w:tcPr>
+              <w:p>
+                <w:pPr>
+                  <w:jc w:val="right"/>
+                  <w:rPr>
+                    <w:rFonts w:ascii="Segoe UI" w:hAnsi="Segoe UI" w:cs="Segoe UI"/>
+                    <w:b/>
+                    <w:bCs/>
+                    <w:sz w:val="16"/>
+                    <w:szCs w:val="16"/>
+                  </w:rPr>
+                </w:pPr>
+                <w:r>
+                  <w:rPr>
+                    <w:rFonts w:ascii="Segoe UI" w:hAnsi="Segoe UI" w:cs="Segoe UI"/>
+                    <w:b/>
+                    <w:bCs/>
+                    <w:sz w:val="16"/>
+                    <w:szCs w:val="16"/>
+                  </w:rPr>
+                  <w:t>ExpensedWIPLbl</w:t>
+                </w:r>
+              </w:p>
+            </w:tc>
+          </w:sdtContent>
+        </w:sdt>
       </w:tr>
       <w:tr>
         <w:trPr>
@@ -4611,6 +4632,8 @@
  
          < E n v i r o n m e n t L b l > E n v i r o n m e n t L b l < / E n v i r o n m e n t L b l >   
+         < E x p e n s e d W I P L b l > E x p e n s e d W I P L b l < / E x p e n s e d W I P L b l > + 
          < N o _ P r o d u c t i o n O r d e r C a p t i o n > N o _ P r o d u c t i o n O r d e r C a p t i o n < / N o _ P r o d u c t i o n O r d e r C a p t i o n >   
          < O u t p u t L b l > O u t p u t L b l < / O u t p u t L b l > @@ -4654,6 +4677,8 @@
          < D e s c _ P r o d u c t i o n O r d e r > D e s c _ P r o d u c t i o n O r d e r < / D e s c _ P r o d u c t i o n O r d e r >   
          < E n d D a t e > E n d D a t e < / E n d D a t e > + 
+         < E x p e n s e d W I P C a p t i o n > E x p e n s e d W I P C a p t i o n < / E x p e n s e d W I P C a p t i o n >   
          < I n v e n t o r y V a l u a t i o n W I P C p t n > I n v e n t o r y V a l u a t i o n W I P C p t n < / I n v e n t o r y V a l u a t i o n W I P C p t n >   
@@ -4906,6 +4931,8 @@
  
          < E n v i r o n m e n t L b l   E l e m e n t T y p e = " P a r a m e t e r "   E l e m e n t I d = " 2 0 1 5 9 0 6 0 7 0 "   D a t a T y p e = " S t r i n g " > E n v i r o n m e n t L b l < / E n v i r o n m e n t L b l >   
+         < E x p e n s e d W I P L b l   E l e m e n t T y p e = " P a r a m e t e r "   E l e m e n t I d = " 2 0 6 6 6 5 3 1 8 9 "   D a t a T y p e = " S t r i n g " > E x p e n s e d W I P L b l < / E x p e n s e d W I P L b l > + 
          < N o _ P r o d u c t i o n O r d e r C a p t i o n   E l e m e n t T y p e = " P a r a m e t e r "   E l e m e n t I d = " 5 5 2 8 8 8 6 2 "   D a t a T y p e = " S t r i n g " > N o _ P r o d u c t i o n O r d e r C a p t i o n < / N o _ P r o d u c t i o n O r d e r C a p t i o n >   
          < O u t p u t L b l   E l e m e n t T y p e = " P a r a m e t e r "   E l e m e n t I d = " 9 2 9 0 1 9 5 8 4 "   D a t a T y p e = " S t r i n g " > O u t p u t L b l < / O u t p u t L b l > @@ -4983,6 +5010,8 @@
          < D e s c _ P r o d u c t i o n O r d e r   E l e m e n t T y p e = " C o l u m n "   E l e m e n t I d = " 1 4 1 2 5 5 5 1 6 2 "   D a t a T y p e = " T e x t " > D e s c _ P r o d u c t i o n O r d e r < / D e s c _ P r o d u c t i o n O r d e r >   
          < E n d D a t e   E l e m e n t T y p e = " C o l u m n "   E l e m e n t I d = " 1 3 0 2 0 8 2 6 1 0 "   D a t a T y p e = " D a t e " > E n d D a t e < / E n d D a t e > + 
+         < E x p e n s e d W I P C a p t i o n   E l e m e n t T y p e = " C o l u m n "   E l e m e n t I d = " 1 2 3 9 9 6 3 6 0 7 "   D a t a T y p e = " L a b e l "   O b s o l e t e S t a t e = " P e n d i n g " > E x p e n s e d W I P C a p t i o n < / E x p e n s e d W I P C a p t i o n >   
          < I n v e n t o r y V a l u a t i o n W I P C p t n   E l e m e n t T y p e = " C o l u m n "   E l e m e n t I d = " 9 8 3 3 4 8 2 1 3 "   D a t a T y p e = " L a b e l "   O b s o l e t e S t a t e = " P e n d i n g " > I n v e n t o r y V a l u a t i o n W I P C p t n < / I n v e n t o r y V a l u a t i o n W I P C p t n >   

</xml_diff>